<commit_message>
Salva ajustes finais dos documentos e sistema
</commit_message>
<xml_diff>
--- a/public/templates/contrato-compra.docx
+++ b/public/templates/contrato-compra.docx
@@ -5,7 +5,7 @@
     <w:p>
       <w:pPr>
         <w:widowControl w:val="0"/>
-        <w:spacing w:after="0" w:line="240" w:lineRule="auto"/>
+        <w:spacing w:after="20" w:line="240" w:lineRule="auto" w:before="0"/>
         <w:jc w:val="center"/>
         <w:rPr>
           <w:rFonts w:asciiTheme="minorHAnsi" w:hAnsiTheme="minorHAnsi" w:cs="Hemi Head 426"/>
@@ -22,39 +22,22 @@
         </w:rPr>
       </w:pPr>
       <w:r>
-        <w:rPr>
-          <w:rFonts w:asciiTheme="minorHAnsi" w:hAnsiTheme="minorHAnsi" w:cs="Hemi Head 426"/>
-          <w:b/>
-          <w:i/>
-          <w:noProof/>
-          <w:color w:val="FF0000"/>
-          <w:sz w:val="60"/>
-          <w:szCs w:val="60"/>
-          <w:lang w:eastAsia="pt-BR"/>
-        </w:rPr>
         <w:drawing>
-          <wp:inline distT="0" distB="0" distL="0" distR="0">
-            <wp:extent cx="4067175" cy="1511843"/>
-            <wp:effectExtent l="0" t="0" r="0" b="0"/>
-            <wp:docPr id="1" name="Imagem 1"/>
+          <wp:inline xmlns:a="http://schemas.openxmlformats.org/drawingml/2006/main" xmlns:pic="http://schemas.openxmlformats.org/drawingml/2006/picture">
+            <wp:extent cx="1800000" cy="669014"/>
+            <wp:docPr id="1" name="Picture 1"/>
             <wp:cNvGraphicFramePr>
-              <a:graphicFrameLocks xmlns:a="http://schemas.openxmlformats.org/drawingml/2006/main" noChangeAspect="1"/>
+              <a:graphicFrameLocks noChangeAspect="1"/>
             </wp:cNvGraphicFramePr>
-            <a:graphic xmlns:a="http://schemas.openxmlformats.org/drawingml/2006/main">
+            <a:graphic>
               <a:graphicData uri="http://schemas.openxmlformats.org/drawingml/2006/picture">
-                <pic:pic xmlns:pic="http://schemas.openxmlformats.org/drawingml/2006/picture">
+                <pic:pic>
                   <pic:nvPicPr>
-                    <pic:cNvPr id="1" name="WhatsApp Image 2026-04-14 at 12.39.28.jpeg"/>
+                    <pic:cNvPr id="0" name="image.jpg"/>
                     <pic:cNvPicPr/>
                   </pic:nvPicPr>
                   <pic:blipFill>
-                    <a:blip r:embed="rId8" cstate="print">
-                      <a:extLst>
-                        <a:ext uri="{28A0092B-C50C-407E-A947-70E740481C1C}">
-                          <a14:useLocalDpi xmlns:a14="http://schemas.microsoft.com/office/drawing/2010/main" val="0"/>
-                        </a:ext>
-                      </a:extLst>
-                    </a:blip>
+                    <a:blip r:embed="rId8"/>
                     <a:stretch>
                       <a:fillRect/>
                     </a:stretch>
@@ -62,11 +45,9 @@
                   <pic:spPr>
                     <a:xfrm>
                       <a:off x="0" y="0"/>
-                      <a:ext cx="4123348" cy="1532723"/>
+                      <a:ext cx="1800000" cy="669014"/>
                     </a:xfrm>
-                    <a:prstGeom prst="rect">
-                      <a:avLst/>
-                    </a:prstGeom>
+                    <a:prstGeom prst="rect"/>
                   </pic:spPr>
                 </pic:pic>
               </a:graphicData>
@@ -78,7 +59,7 @@
     <w:p>
       <w:pPr>
         <w:widowControl w:val="0"/>
-        <w:spacing w:after="0" w:line="240" w:lineRule="auto"/>
+        <w:spacing w:after="0" w:line="240" w:lineRule="auto" w:before="0"/>
         <w:jc w:val="center"/>
         <w:rPr>
           <w:rFonts w:asciiTheme="minorHAnsi" w:hAnsiTheme="minorHAnsi" w:cs="Hemi Head 426"/>
@@ -93,8 +74,21 @@
           </w14:shadow>
         </w:rPr>
       </w:pPr>
-      <w:bookmarkStart w:id="0" w:name="_GoBack"/>
-      <w:r>
+      <w:r>
+        <w:rPr>
+          <w:rFonts w:ascii="Arial" w:hAnsi="Arial" w:eastAsia="Arial" w:cs="Arial"/>
+          <w:b w:val="0"/>
+          <w:i w:val="0"/>
+          <w:sz w:val="14"/>
+        </w:rPr>
+        <w:t>AV: ANDRÔMEDA, 3521 – CEP 12.233-000 – SÃO JOSÉ DOS CAMPOS – SP</w:t>
+      </w:r>
+    </w:p>
+    <w:p>
+      <w:pPr>
+        <w:widowControl w:val="0"/>
+        <w:spacing w:after="0" w:line="240" w:lineRule="auto" w:before="0"/>
+        <w:jc w:val="center"/>
         <w:rPr>
           <w:rFonts w:asciiTheme="minorHAnsi" w:hAnsiTheme="minorHAnsi" w:cs="Hemi Head 426"/>
           <w:i/>
@@ -107,9 +101,22 @@
             </w14:schemeClr>
           </w14:shadow>
         </w:rPr>
-        <w:t>AV: ANDRÔ</w:t>
-      </w:r>
-      <w:r>
+      </w:pPr>
+      <w:r>
+        <w:rPr>
+          <w:rFonts w:ascii="Arial" w:hAnsi="Arial" w:eastAsia="Arial" w:cs="Arial"/>
+          <w:b w:val="0"/>
+          <w:i w:val="0"/>
+          <w:sz w:val="14"/>
+        </w:rPr>
+        <w:t>TELEFONE: (12) 3917-3777 / (12) 99662-6666</w:t>
+      </w:r>
+    </w:p>
+    <w:p>
+      <w:pPr>
+        <w:widowControl w:val="0"/>
+        <w:spacing w:after="0" w:line="240" w:lineRule="auto" w:before="0"/>
+        <w:jc w:val="center"/>
         <w:rPr>
           <w:rFonts w:asciiTheme="minorHAnsi" w:hAnsiTheme="minorHAnsi" w:cs="Hemi Head 426"/>
           <w:i/>
@@ -122,462 +129,727 @@
             </w14:schemeClr>
           </w14:shadow>
         </w:rPr>
-        <w:t>MEDA, 3521 – CEP 12.233-000 – SÃO JOSÉ DOS CAMPOS – SP</w:t>
-      </w:r>
-    </w:p>
-    <w:p>
-      <w:pPr>
-        <w:widowControl w:val="0"/>
-        <w:spacing w:after="0" w:line="240" w:lineRule="auto"/>
-        <w:jc w:val="center"/>
+      </w:pPr>
+      <w:r>
+        <w:rPr>
+          <w:rFonts w:ascii="Arial" w:hAnsi="Arial" w:eastAsia="Arial" w:cs="Arial"/>
+          <w:b w:val="0"/>
+          <w:i w:val="0"/>
+          <w:sz w:val="14"/>
+        </w:rPr>
+        <w:t>CNPJ: 67.806.748/0001-57</w:t>
+      </w:r>
+    </w:p>
+    <w:bookmarkEnd w:id="0"/>
+    <w:p>
+      <w:pPr>
+        <w:widowControl w:val="0"/>
+        <w:spacing w:after="0" w:line="40" w:lineRule="exact" w:before="0"/>
+        <w:jc w:val="both"/>
         <w:rPr>
           <w:rFonts w:asciiTheme="minorHAnsi" w:hAnsiTheme="minorHAnsi" w:cs="Hemi Head 426"/>
-          <w:i/>
+          <w:color w:val="000000" w:themeColor="text1"/>
+          <w:sz w:val="24"/>
+          <w:szCs w:val="24"/>
+        </w:rPr>
+      </w:pPr>
+      <w:r>
+        <w:rPr>
+          <w:rFonts w:ascii="Arial" w:hAnsi="Arial" w:eastAsia="Arial" w:cs="Arial"/>
+          <w:sz w:val="4"/>
+        </w:rPr>
+      </w:r>
+    </w:p>
+    <w:p>
+      <w:pPr>
+        <w:widowControl w:val="0"/>
+        <w:spacing w:after="0" w:line="40" w:lineRule="exact" w:before="0"/>
+        <w:jc w:val="both"/>
+        <w:rPr>
+          <w:rFonts w:asciiTheme="minorHAnsi" w:hAnsiTheme="minorHAnsi" w:cs="Hemi Head 426"/>
+          <w:color w:val="000000" w:themeColor="text1"/>
+          <w:sz w:val="24"/>
+          <w:szCs w:val="24"/>
+        </w:rPr>
+      </w:pPr>
+      <w:r>
+        <w:rPr>
+          <w:rFonts w:ascii="Arial" w:hAnsi="Arial" w:eastAsia="Arial" w:cs="Arial"/>
+          <w:sz w:val="4"/>
+        </w:rPr>
+      </w:r>
+    </w:p>
+    <w:p>
+      <w:pPr>
+        <w:widowControl w:val="0"/>
+        <w:spacing w:after="0" w:line="40" w:lineRule="exact" w:before="0"/>
+        <w:jc w:val="both"/>
+        <w:rPr>
+          <w:rFonts w:asciiTheme="minorHAnsi" w:hAnsiTheme="minorHAnsi" w:cs="Hemi Head 426"/>
+          <w:color w:val="000000" w:themeColor="text1"/>
+          <w:sz w:val="24"/>
+          <w:szCs w:val="24"/>
+        </w:rPr>
+      </w:pPr>
+      <w:r>
+        <w:rPr>
+          <w:rFonts w:ascii="Arial" w:hAnsi="Arial" w:eastAsia="Arial" w:cs="Arial"/>
+          <w:sz w:val="4"/>
+        </w:rPr>
+      </w:r>
+    </w:p>
+    <w:p>
+      <w:pPr>
+        <w:widowControl w:val="0"/>
+        <w:spacing w:after="40" w:line="259" w:lineRule="auto" w:before="0"/>
+        <w:jc w:val="both"/>
+        <w:rPr>
+          <w:rFonts w:cs="Hemi Head 426"/>
+          <w:color w:val="000000"/>
+        </w:rPr>
+      </w:pPr>
+      <w:proofErr w:type="spellStart"/>
+      <w:proofErr w:type="spellEnd"/>
+      <w:r>
+        <w:rPr>
+          <w:rFonts w:ascii="Arial" w:hAnsi="Arial" w:eastAsia="Arial" w:cs="Arial"/>
+          <w:b w:val="0"/>
+          <w:sz w:val="20"/>
+        </w:rPr>
+        <w:t xml:space="preserve">Eu, </w:t>
+      </w:r>
+      <w:r>
+        <w:rPr>
+          <w:rFonts w:ascii="Arial" w:hAnsi="Arial" w:eastAsia="Arial" w:cs="Arial"/>
+          <w:b/>
+          <w:sz w:val="20"/>
+        </w:rPr>
+        <w:t>{fornecedor_nome}</w:t>
+      </w:r>
+      <w:r>
+        <w:rPr>
+          <w:rFonts w:ascii="Arial" w:hAnsi="Arial" w:eastAsia="Arial" w:cs="Arial"/>
+          <w:b w:val="0"/>
+          <w:sz w:val="20"/>
+        </w:rPr>
+        <w:t xml:space="preserve"> portador RG nº </w:t>
+      </w:r>
+      <w:r>
+        <w:rPr>
+          <w:rFonts w:ascii="Arial" w:hAnsi="Arial" w:eastAsia="Arial" w:cs="Arial"/>
+          <w:b/>
+          <w:sz w:val="20"/>
+        </w:rPr>
+        <w:t>{fornecedor_rg}</w:t>
+      </w:r>
+      <w:r>
+        <w:rPr>
+          <w:rFonts w:ascii="Arial" w:hAnsi="Arial" w:eastAsia="Arial" w:cs="Arial"/>
+          <w:b w:val="0"/>
+          <w:sz w:val="20"/>
+        </w:rPr>
+        <w:t xml:space="preserve"> SSP/SP e Do CPF nº </w:t>
+      </w:r>
+      <w:r>
+        <w:rPr>
+          <w:rFonts w:ascii="Arial" w:hAnsi="Arial" w:eastAsia="Arial" w:cs="Arial"/>
+          <w:b/>
+          <w:sz w:val="20"/>
+        </w:rPr>
+        <w:t>{fornecedor_cpf}</w:t>
+      </w:r>
+      <w:r>
+        <w:rPr>
+          <w:rFonts w:ascii="Arial" w:hAnsi="Arial" w:eastAsia="Arial" w:cs="Arial"/>
+          <w:b w:val="0"/>
+          <w:sz w:val="20"/>
+        </w:rPr>
+        <w:t xml:space="preserve">   Residente e domiciliado à av / rua: </w:t>
+      </w:r>
+      <w:r>
+        <w:rPr>
+          <w:rFonts w:ascii="Arial" w:hAnsi="Arial" w:eastAsia="Arial" w:cs="Arial"/>
+          <w:b/>
+          <w:sz w:val="20"/>
+        </w:rPr>
+        <w:t>{fornecedor_rua}</w:t>
+      </w:r>
+      <w:r>
+        <w:rPr>
+          <w:rFonts w:ascii="Arial" w:hAnsi="Arial" w:eastAsia="Arial" w:cs="Arial"/>
+          <w:b w:val="0"/>
+          <w:sz w:val="20"/>
+        </w:rPr>
+        <w:t xml:space="preserve"> nº </w:t>
+      </w:r>
+      <w:r>
+        <w:rPr>
+          <w:rFonts w:ascii="Arial" w:hAnsi="Arial" w:eastAsia="Arial" w:cs="Arial"/>
+          <w:b/>
+          <w:sz w:val="20"/>
+        </w:rPr>
+        <w:t>{fornecedor_numero}{fornecedor_complemento_texto}</w:t>
+      </w:r>
+      <w:r>
+        <w:rPr>
+          <w:rFonts w:ascii="Arial" w:hAnsi="Arial" w:eastAsia="Arial" w:cs="Arial"/>
+          <w:b w:val="0"/>
+          <w:sz w:val="20"/>
+        </w:rPr>
+        <w:t xml:space="preserve">  Bairro: </w:t>
+      </w:r>
+      <w:r>
+        <w:rPr>
+          <w:rFonts w:ascii="Arial" w:hAnsi="Arial" w:eastAsia="Arial" w:cs="Arial"/>
+          <w:b/>
+          <w:sz w:val="20"/>
+        </w:rPr>
+        <w:t>{fornecedor_bairro}</w:t>
+      </w:r>
+      <w:r>
+        <w:rPr>
+          <w:rFonts w:ascii="Arial" w:hAnsi="Arial" w:eastAsia="Arial" w:cs="Arial"/>
+          <w:b w:val="0"/>
+          <w:sz w:val="20"/>
+        </w:rPr>
+        <w:t xml:space="preserve">  na Cidade de </w:t>
+      </w:r>
+      <w:r>
+        <w:rPr>
+          <w:rFonts w:ascii="Arial" w:hAnsi="Arial" w:eastAsia="Arial" w:cs="Arial"/>
+          <w:b/>
+          <w:sz w:val="20"/>
+        </w:rPr>
+        <w:t>{fornecedor_cidade}</w:t>
+      </w:r>
+      <w:r>
+        <w:rPr>
+          <w:rFonts w:ascii="Arial" w:hAnsi="Arial" w:eastAsia="Arial" w:cs="Arial"/>
+          <w:b w:val="0"/>
+          <w:sz w:val="20"/>
+        </w:rPr>
+        <w:t xml:space="preserve"> - </w:t>
+      </w:r>
+      <w:r>
+        <w:rPr>
+          <w:rFonts w:ascii="Arial" w:hAnsi="Arial" w:eastAsia="Arial" w:cs="Arial"/>
+          <w:b/>
+          <w:sz w:val="20"/>
+        </w:rPr>
+        <w:t>{fornecedor_estado}</w:t>
+      </w:r>
+      <w:r>
+        <w:rPr>
+          <w:rFonts w:ascii="Arial" w:hAnsi="Arial" w:eastAsia="Arial" w:cs="Arial"/>
+          <w:b w:val="0"/>
+          <w:sz w:val="20"/>
+        </w:rPr>
+        <w:t xml:space="preserve">      CEP </w:t>
+      </w:r>
+      <w:r>
+        <w:rPr>
+          <w:rFonts w:ascii="Arial" w:hAnsi="Arial" w:eastAsia="Arial" w:cs="Arial"/>
+          <w:b/>
+          <w:sz w:val="20"/>
+        </w:rPr>
+        <w:t>{fornecedor_cep}</w:t>
+      </w:r>
+      <w:r>
+        <w:rPr>
+          <w:rFonts w:ascii="Arial" w:hAnsi="Arial" w:eastAsia="Arial" w:cs="Arial"/>
+          <w:b w:val="0"/>
+          <w:sz w:val="20"/>
+        </w:rPr>
+        <w:t xml:space="preserve"> telefone </w:t>
+      </w:r>
+      <w:r>
+        <w:rPr>
+          <w:rFonts w:ascii="Arial" w:hAnsi="Arial" w:eastAsia="Arial" w:cs="Arial"/>
+          <w:b/>
+          <w:sz w:val="20"/>
+        </w:rPr>
+        <w:t>{fornecedor_telefone}</w:t>
+      </w:r>
+      <w:r>
+        <w:rPr>
+          <w:rFonts w:ascii="Arial" w:hAnsi="Arial" w:eastAsia="Arial" w:cs="Arial"/>
+          <w:b w:val="0"/>
+          <w:sz w:val="20"/>
+        </w:rPr>
+        <w:t xml:space="preserve"> Neste ato denominado simplesmente Como </w:t>
+      </w:r>
+      <w:r>
+        <w:rPr>
+          <w:rFonts w:ascii="Arial" w:hAnsi="Arial" w:eastAsia="Arial" w:cs="Arial"/>
+          <w:b/>
+          <w:sz w:val="20"/>
+        </w:rPr>
+        <w:t>VENDEDOR</w:t>
+      </w:r>
+      <w:r>
+        <w:rPr>
+          <w:rFonts w:ascii="Arial" w:hAnsi="Arial" w:eastAsia="Arial" w:cs="Arial"/>
+          <w:b w:val="0"/>
+          <w:sz w:val="20"/>
+        </w:rPr>
+        <w:t xml:space="preserve">, declaro ter recebido o valor de R$ </w:t>
+      </w:r>
+      <w:r>
+        <w:rPr>
+          <w:rFonts w:ascii="Arial" w:hAnsi="Arial" w:eastAsia="Arial" w:cs="Arial"/>
+          <w:b/>
+          <w:sz w:val="20"/>
+        </w:rPr>
+        <w:t>{valor_compra_extenso}</w:t>
+      </w:r>
+      <w:r>
+        <w:rPr>
+          <w:rFonts w:ascii="Arial" w:hAnsi="Arial" w:eastAsia="Arial" w:cs="Arial"/>
+          <w:b w:val="0"/>
+          <w:sz w:val="20"/>
+        </w:rPr>
+        <w:t xml:space="preserve"> ( </w:t>
+      </w:r>
+      <w:r>
+        <w:rPr>
+          <w:rFonts w:ascii="Arial" w:hAnsi="Arial" w:eastAsia="Arial" w:cs="Arial"/>
+          <w:b/>
+          <w:sz w:val="20"/>
+        </w:rPr>
+        <w:t>{valor_compra}</w:t>
+      </w:r>
+      <w:r>
+        <w:rPr>
+          <w:rFonts w:ascii="Arial" w:hAnsi="Arial" w:eastAsia="Arial" w:cs="Arial"/>
+          <w:b w:val="0"/>
+          <w:sz w:val="20"/>
+        </w:rPr>
+        <w:t xml:space="preserve"> ) referente venda do Veículo marca / modelo </w:t>
+      </w:r>
+      <w:r>
+        <w:rPr>
+          <w:rFonts w:ascii="Arial" w:hAnsi="Arial" w:eastAsia="Arial" w:cs="Arial"/>
+          <w:b/>
+          <w:sz w:val="20"/>
+        </w:rPr>
+        <w:t>{moto_marca_modelo}</w:t>
+      </w:r>
+      <w:r>
+        <w:rPr>
+          <w:rFonts w:ascii="Arial" w:hAnsi="Arial" w:eastAsia="Arial" w:cs="Arial"/>
+          <w:b w:val="0"/>
+          <w:sz w:val="20"/>
+        </w:rPr>
+        <w:t xml:space="preserve"> com Placa: </w:t>
+      </w:r>
+      <w:r>
+        <w:rPr>
+          <w:rFonts w:ascii="Arial" w:hAnsi="Arial" w:eastAsia="Arial" w:cs="Arial"/>
+          <w:b/>
+          <w:sz w:val="20"/>
+        </w:rPr>
+        <w:t>{moto_placa}</w:t>
+      </w:r>
+      <w:r>
+        <w:rPr>
+          <w:rFonts w:ascii="Arial" w:hAnsi="Arial" w:eastAsia="Arial" w:cs="Arial"/>
+          <w:b w:val="0"/>
+          <w:sz w:val="20"/>
+        </w:rPr>
+        <w:t xml:space="preserve"> de cor: </w:t>
+      </w:r>
+      <w:r>
+        <w:rPr>
+          <w:rFonts w:ascii="Arial" w:hAnsi="Arial" w:eastAsia="Arial" w:cs="Arial"/>
+          <w:b/>
+          <w:sz w:val="20"/>
+        </w:rPr>
+        <w:t>{moto_cor}</w:t>
+      </w:r>
+      <w:r>
+        <w:rPr>
+          <w:rFonts w:ascii="Arial" w:hAnsi="Arial" w:eastAsia="Arial" w:cs="Arial"/>
+          <w:b w:val="0"/>
+          <w:sz w:val="20"/>
+        </w:rPr>
+        <w:t xml:space="preserve"> RENAVAM: </w:t>
+      </w:r>
+      <w:r>
+        <w:rPr>
+          <w:rFonts w:ascii="Arial" w:hAnsi="Arial" w:eastAsia="Arial" w:cs="Arial"/>
+          <w:b/>
+          <w:sz w:val="20"/>
+        </w:rPr>
+        <w:t>{moto_renavam}</w:t>
+      </w:r>
+      <w:r>
+        <w:rPr>
+          <w:rFonts w:ascii="Arial" w:hAnsi="Arial" w:eastAsia="Arial" w:cs="Arial"/>
+          <w:b w:val="0"/>
+          <w:sz w:val="20"/>
+        </w:rPr>
+        <w:t xml:space="preserve"> CHASSI: </w:t>
+      </w:r>
+      <w:r>
+        <w:rPr>
+          <w:rFonts w:ascii="Arial" w:hAnsi="Arial" w:eastAsia="Arial" w:cs="Arial"/>
+          <w:b/>
+          <w:sz w:val="20"/>
+        </w:rPr>
+        <w:t>{moto_chassi}</w:t>
+      </w:r>
+    </w:p>
+    <w:p>
+      <w:pPr>
+        <w:widowControl w:val="0"/>
+        <w:spacing w:after="40" w:line="259" w:lineRule="auto" w:before="0"/>
+        <w:jc w:val="both"/>
+        <w:rPr>
+          <w:rFonts w:cs="Hemi Head 426"/>
+          <w:b/>
+          <w:color w:val="000000"/>
+        </w:rPr>
+      </w:pPr>
+      <w:r>
+        <w:rPr>
+          <w:rFonts w:ascii="Arial" w:hAnsi="Arial" w:eastAsia="Arial" w:cs="Arial"/>
+          <w:b w:val="0"/>
+          <w:sz w:val="20"/>
+        </w:rPr>
+        <w:t xml:space="preserve">Ano de fabricação / modelo </w:t>
+      </w:r>
+      <w:r>
+        <w:rPr>
+          <w:rFonts w:ascii="Arial" w:hAnsi="Arial" w:eastAsia="Arial" w:cs="Arial"/>
+          <w:b/>
+          <w:sz w:val="20"/>
+        </w:rPr>
+        <w:t>{moto_ano_fabricacao}</w:t>
+      </w:r>
+      <w:r>
+        <w:rPr>
+          <w:rFonts w:ascii="Arial" w:hAnsi="Arial" w:eastAsia="Arial" w:cs="Arial"/>
+          <w:b w:val="0"/>
+          <w:sz w:val="20"/>
+        </w:rPr>
+        <w:t xml:space="preserve"> / </w:t>
+      </w:r>
+      <w:r>
+        <w:rPr>
+          <w:rFonts w:ascii="Arial" w:hAnsi="Arial" w:eastAsia="Arial" w:cs="Arial"/>
+          <w:b/>
+          <w:sz w:val="20"/>
+        </w:rPr>
+        <w:t>{moto_ano_modelo}</w:t>
+      </w:r>
+      <w:r>
+        <w:rPr>
+          <w:rFonts w:ascii="Arial" w:hAnsi="Arial" w:eastAsia="Arial" w:cs="Arial"/>
+          <w:b w:val="0"/>
+          <w:sz w:val="20"/>
+        </w:rPr>
+        <w:t xml:space="preserve">         KM: </w:t>
+      </w:r>
+      <w:r>
+        <w:rPr>
+          <w:rFonts w:ascii="Arial" w:hAnsi="Arial" w:eastAsia="Arial" w:cs="Arial"/>
+          <w:b/>
+          <w:sz w:val="20"/>
+        </w:rPr>
+        <w:t>{moto_km}</w:t>
+      </w:r>
+    </w:p>
+    <w:p>
+      <w:pPr>
+        <w:widowControl w:val="0"/>
+        <w:spacing w:after="0" w:line="40" w:lineRule="exact" w:before="0"/>
+        <w:jc w:val="both"/>
+        <w:rPr>
+          <w:rFonts w:cs="Hemi Head 426"/>
+          <w:color w:val="000000"/>
+        </w:rPr>
+      </w:pPr>
+      <w:r>
+        <w:rPr>
+          <w:rFonts w:ascii="Arial" w:hAnsi="Arial" w:eastAsia="Arial" w:cs="Arial"/>
+          <w:sz w:val="4"/>
+        </w:rPr>
+      </w:r>
+    </w:p>
+    <w:p>
+      <w:pPr>
+        <w:widowControl w:val="0"/>
+        <w:spacing w:after="40" w:line="259" w:lineRule="auto" w:before="0"/>
+        <w:jc w:val="both"/>
+        <w:rPr>
+          <w:color w:val="000000" w:themeColor="text1"/>
+          <w:sz w:val="24"/>
+          <w:szCs w:val="24"/>
+        </w:rPr>
+      </w:pPr>
+      <w:proofErr w:type="gramStart"/>
+      <w:proofErr w:type="gramEnd"/>
+      <w:r>
+        <w:rPr>
+          <w:rFonts w:ascii="Arial" w:hAnsi="Arial" w:eastAsia="Arial" w:cs="Arial"/>
+          <w:b/>
+          <w:sz w:val="20"/>
+        </w:rPr>
+        <w:t>Observação:</w:t>
+      </w:r>
+      <w:r>
+        <w:rPr>
+          <w:rFonts w:ascii="Arial" w:hAnsi="Arial" w:eastAsia="Arial" w:cs="Arial"/>
+          <w:b w:val="0"/>
+          <w:sz w:val="20"/>
+        </w:rPr>
+        <w:t xml:space="preserve"> </w:t>
+      </w:r>
+      <w:r>
+        <w:rPr>
+          <w:rFonts w:ascii="Arial" w:hAnsi="Arial" w:eastAsia="Arial" w:cs="Arial"/>
+          <w:b/>
+          <w:sz w:val="20"/>
+        </w:rPr>
+        <w:t>{observacoes}</w:t>
+      </w:r>
+      <w:r>
+        <w:rPr>
+          <w:rFonts w:ascii="Arial" w:hAnsi="Arial" w:eastAsia="Arial" w:cs="Arial"/>
+          <w:b w:val="0"/>
+          <w:sz w:val="20"/>
+        </w:rPr>
+        <w:t>.</w:t>
+      </w:r>
+    </w:p>
+    <w:p>
+      <w:pPr>
+        <w:widowControl w:val="0"/>
+        <w:spacing w:after="0" w:line="40" w:lineRule="exact" w:before="0"/>
+        <w:jc w:val="both"/>
+        <w:rPr>
           <w:color w:val="000000" w:themeColor="text1"/>
           <w:sz w:val="16"/>
           <w:szCs w:val="16"/>
-          <w14:shadow w14:blurRad="38100" w14:dist="19050" w14:dir="2700000" w14:sx="100000" w14:sy="100000" w14:kx="0" w14:ky="0" w14:algn="tl">
-            <w14:schemeClr w14:val="dk1">
-              <w14:alpha w14:val="60000"/>
-            </w14:schemeClr>
-          </w14:shadow>
-        </w:rPr>
-      </w:pPr>
-      <w:r>
-        <w:rPr>
-          <w:rFonts w:asciiTheme="minorHAnsi" w:hAnsiTheme="minorHAnsi" w:cs="Hemi Head 426"/>
-          <w:i/>
+        </w:rPr>
+      </w:pPr>
+      <w:r>
+        <w:rPr>
+          <w:rFonts w:ascii="Arial" w:hAnsi="Arial" w:eastAsia="Arial" w:cs="Arial"/>
+          <w:sz w:val="4"/>
+        </w:rPr>
+      </w:r>
+    </w:p>
+    <w:p>
+      <w:pPr>
+        <w:widowControl w:val="0"/>
+        <w:spacing w:after="0" w:line="40" w:lineRule="exact" w:before="0"/>
+        <w:jc w:val="both"/>
+        <w:rPr>
           <w:color w:val="000000" w:themeColor="text1"/>
           <w:sz w:val="16"/>
           <w:szCs w:val="16"/>
-          <w14:shadow w14:blurRad="38100" w14:dist="19050" w14:dir="2700000" w14:sx="100000" w14:sy="100000" w14:kx="0" w14:ky="0" w14:algn="tl">
-            <w14:schemeClr w14:val="dk1">
-              <w14:alpha w14:val="60000"/>
-            </w14:schemeClr>
-          </w14:shadow>
-        </w:rPr>
-        <w:t>TELEFONE: (12) 3917-3777 / (12) 99662-6666</w:t>
-      </w:r>
-      <w:r>
-        <w:rPr>
-          <w:rFonts w:asciiTheme="minorHAnsi" w:hAnsiTheme="minorHAnsi" w:cs="Hemi Head 426"/>
-          <w:i/>
+        </w:rPr>
+      </w:pPr>
+      <w:r>
+        <w:rPr>
+          <w:rFonts w:ascii="Arial" w:hAnsi="Arial" w:eastAsia="Arial" w:cs="Arial"/>
+          <w:sz w:val="4"/>
+        </w:rPr>
+      </w:r>
+    </w:p>
+    <w:p>
+      <w:pPr>
+        <w:widowControl w:val="0"/>
+        <w:spacing w:after="0" w:line="40" w:lineRule="exact" w:before="0"/>
+        <w:jc w:val="both"/>
+        <w:rPr>
           <w:color w:val="000000" w:themeColor="text1"/>
           <w:sz w:val="16"/>
           <w:szCs w:val="16"/>
-          <w14:shadow w14:blurRad="38100" w14:dist="19050" w14:dir="2700000" w14:sx="100000" w14:sy="100000" w14:kx="0" w14:ky="0" w14:algn="tl">
-            <w14:schemeClr w14:val="dk1">
-              <w14:alpha w14:val="60000"/>
-            </w14:schemeClr>
-          </w14:shadow>
-        </w:rPr>
-        <w:t xml:space="preserve"> </w:t>
-      </w:r>
-    </w:p>
-    <w:p>
-      <w:pPr>
-        <w:widowControl w:val="0"/>
-        <w:spacing w:after="0" w:line="240" w:lineRule="auto"/>
-        <w:jc w:val="center"/>
-        <w:rPr>
-          <w:rFonts w:asciiTheme="minorHAnsi" w:hAnsiTheme="minorHAnsi" w:cs="Hemi Head 426"/>
-          <w:i/>
+        </w:rPr>
+      </w:pPr>
+      <w:r>
+        <w:rPr>
+          <w:rFonts w:ascii="Arial" w:hAnsi="Arial" w:eastAsia="Arial" w:cs="Arial"/>
+          <w:sz w:val="4"/>
+        </w:rPr>
+      </w:r>
+    </w:p>
+    <w:p>
+      <w:pPr>
+        <w:widowControl w:val="0"/>
+        <w:spacing w:after="0" w:line="40" w:lineRule="exact" w:before="0"/>
+        <w:jc w:val="both"/>
+        <w:rPr>
           <w:color w:val="000000" w:themeColor="text1"/>
           <w:sz w:val="16"/>
           <w:szCs w:val="16"/>
-          <w14:shadow w14:blurRad="38100" w14:dist="19050" w14:dir="2700000" w14:sx="100000" w14:sy="100000" w14:kx="0" w14:ky="0" w14:algn="tl">
-            <w14:schemeClr w14:val="dk1">
-              <w14:alpha w14:val="60000"/>
-            </w14:schemeClr>
-          </w14:shadow>
-        </w:rPr>
-      </w:pPr>
-      <w:r>
-        <w:rPr>
-          <w:rFonts w:asciiTheme="minorHAnsi" w:hAnsiTheme="minorHAnsi" w:cs="Hemi Head 426"/>
-          <w:i/>
-          <w:color w:val="000000" w:themeColor="text1"/>
-          <w:sz w:val="20"/>
-          <w:szCs w:val="20"/>
-          <w14:shadow w14:blurRad="38100" w14:dist="19050" w14:dir="2700000" w14:sx="100000" w14:sy="100000" w14:kx="0" w14:ky="0" w14:algn="tl">
-            <w14:schemeClr w14:val="dk1">
-              <w14:alpha w14:val="60000"/>
-            </w14:schemeClr>
-          </w14:shadow>
-        </w:rPr>
-        <w:t>CNPJ: 67.806.748 / 0001-57</w:t>
-      </w:r>
-    </w:p>
-    <w:bookmarkEnd w:id="0"/>
-    <w:p>
-      <w:pPr>
-        <w:widowControl w:val="0"/>
-        <w:spacing w:after="0" w:line="240" w:lineRule="auto"/>
-        <w:jc w:val="both"/>
-        <w:rPr>
-          <w:rFonts w:asciiTheme="minorHAnsi" w:hAnsiTheme="minorHAnsi" w:cs="Hemi Head 426"/>
+        </w:rPr>
+      </w:pPr>
+      <w:r>
+        <w:rPr>
+          <w:rFonts w:ascii="Arial" w:hAnsi="Arial" w:eastAsia="Arial" w:cs="Arial"/>
+          <w:sz w:val="4"/>
+        </w:rPr>
+      </w:r>
+    </w:p>
+    <w:p>
+      <w:pPr>
+        <w:widowControl w:val="0"/>
+        <w:spacing w:after="0" w:line="40" w:lineRule="exact" w:before="0"/>
+        <w:jc w:val="both"/>
+        <w:rPr>
+          <w:color w:val="000000" w:themeColor="text1"/>
+          <w:sz w:val="16"/>
+          <w:szCs w:val="16"/>
+        </w:rPr>
+      </w:pPr>
+      <w:r>
+        <w:rPr>
+          <w:rFonts w:ascii="Arial" w:hAnsi="Arial" w:eastAsia="Arial" w:cs="Arial"/>
+          <w:sz w:val="4"/>
+        </w:rPr>
+      </w:r>
+    </w:p>
+    <w:p>
+      <w:pPr>
+        <w:widowControl w:val="0"/>
+        <w:spacing w:after="40" w:line="259" w:lineRule="auto" w:before="0"/>
+        <w:jc w:val="both"/>
+        <w:rPr>
           <w:color w:val="000000" w:themeColor="text1"/>
           <w:sz w:val="24"/>
           <w:szCs w:val="24"/>
         </w:rPr>
       </w:pPr>
-    </w:p>
-    <w:p>
-      <w:pPr>
-        <w:widowControl w:val="0"/>
-        <w:spacing w:after="0" w:line="240" w:lineRule="auto"/>
-        <w:jc w:val="both"/>
-        <w:rPr>
-          <w:rFonts w:asciiTheme="minorHAnsi" w:hAnsiTheme="minorHAnsi" w:cs="Hemi Head 426"/>
+      <w:r>
+        <w:rPr>
+          <w:rFonts w:ascii="Arial" w:hAnsi="Arial" w:eastAsia="Arial" w:cs="Arial"/>
+          <w:color w:val="000000" w:themeColor="text1"/>
+          <w:sz w:val="20"/>
+          <w:szCs w:val="24"/>
+        </w:rPr>
+        <w:t xml:space="preserve">O </w:t>
+      </w:r>
+      <w:r>
+        <w:rPr>
+          <w:rFonts w:ascii="Arial" w:hAnsi="Arial" w:eastAsia="Arial" w:cs="Arial"/>
+          <w:b/>
+          <w:color w:val="000000" w:themeColor="text1"/>
+          <w:sz w:val="20"/>
+          <w:szCs w:val="24"/>
+        </w:rPr>
+        <w:t>VENDEDOR</w:t>
+      </w:r>
+      <w:r>
+        <w:rPr>
+          <w:rFonts w:ascii="Arial" w:hAnsi="Arial" w:eastAsia="Arial" w:cs="Arial"/>
+          <w:color w:val="000000" w:themeColor="text1"/>
+          <w:sz w:val="20"/>
+          <w:szCs w:val="24"/>
+        </w:rPr>
+        <w:t xml:space="preserve"> fica ciente de sua responsabilidade civil e criminal quanto ao veículo acima descrito.</w:t>
+      </w:r>
+    </w:p>
+    <w:p>
+      <w:pPr>
+        <w:widowControl w:val="0"/>
+        <w:spacing w:after="0" w:line="40" w:lineRule="exact" w:before="0"/>
+        <w:jc w:val="both"/>
+        <w:rPr>
+          <w:color w:val="000000" w:themeColor="text1"/>
+          <w:sz w:val="16"/>
+          <w:szCs w:val="16"/>
+        </w:rPr>
+      </w:pPr>
+      <w:r>
+        <w:rPr>
+          <w:rFonts w:ascii="Arial" w:hAnsi="Arial" w:eastAsia="Arial" w:cs="Arial"/>
+          <w:sz w:val="4"/>
+        </w:rPr>
+      </w:r>
+    </w:p>
+    <w:p>
+      <w:pPr>
+        <w:widowControl w:val="0"/>
+        <w:spacing w:after="40" w:line="259" w:lineRule="auto" w:before="0"/>
+        <w:jc w:val="both"/>
+        <w:rPr>
           <w:color w:val="000000" w:themeColor="text1"/>
           <w:sz w:val="24"/>
           <w:szCs w:val="24"/>
         </w:rPr>
       </w:pPr>
-    </w:p>
-    <w:p>
-      <w:pPr>
-        <w:widowControl w:val="0"/>
-        <w:spacing w:after="0" w:line="240" w:lineRule="auto"/>
-        <w:jc w:val="both"/>
-        <w:rPr>
-          <w:rFonts w:asciiTheme="minorHAnsi" w:hAnsiTheme="minorHAnsi" w:cs="Hemi Head 426"/>
+      <w:r>
+        <w:rPr>
+          <w:rFonts w:ascii="Arial" w:hAnsi="Arial" w:eastAsia="Arial" w:cs="Arial"/>
+          <w:color w:val="000000" w:themeColor="text1"/>
+          <w:sz w:val="20"/>
+          <w:szCs w:val="24"/>
+        </w:rPr>
+        <w:t xml:space="preserve">É também responsabilidade do </w:t>
+      </w:r>
+      <w:r>
+        <w:rPr>
+          <w:rFonts w:ascii="Arial" w:hAnsi="Arial" w:eastAsia="Arial" w:cs="Arial"/>
+          <w:b/>
+          <w:color w:val="000000" w:themeColor="text1"/>
+          <w:sz w:val="20"/>
+          <w:szCs w:val="24"/>
+        </w:rPr>
+        <w:t>VENDEDOR</w:t>
+      </w:r>
+      <w:r>
+        <w:rPr>
+          <w:rFonts w:ascii="Arial" w:hAnsi="Arial" w:eastAsia="Arial" w:cs="Arial"/>
+          <w:color w:val="000000" w:themeColor="text1"/>
+          <w:sz w:val="20"/>
+          <w:szCs w:val="24"/>
+        </w:rPr>
+        <w:t xml:space="preserve"> multas e débitos existente</w:t>
+      </w:r>
+      <w:r>
+        <w:rPr>
+          <w:rFonts w:ascii="Arial" w:hAnsi="Arial" w:eastAsia="Arial" w:cs="Arial"/>
+          <w:color w:val="000000" w:themeColor="text1"/>
+          <w:sz w:val="20"/>
+          <w:szCs w:val="24"/>
+        </w:rPr>
+        <w:t>s</w:t>
+      </w:r>
+      <w:r>
+        <w:rPr>
+          <w:rFonts w:ascii="Arial" w:hAnsi="Arial" w:eastAsia="Arial" w:cs="Arial"/>
+          <w:color w:val="000000" w:themeColor="text1"/>
+          <w:sz w:val="20"/>
+          <w:szCs w:val="24"/>
+        </w:rPr>
+        <w:t xml:space="preserve"> até a presente data, salvo aquelas acordadas entre as partes.</w:t>
+      </w:r>
+    </w:p>
+    <w:p>
+      <w:pPr>
+        <w:widowControl w:val="0"/>
+        <w:spacing w:after="0" w:line="40" w:lineRule="exact" w:before="0"/>
+        <w:jc w:val="both"/>
+        <w:rPr>
           <w:color w:val="000000" w:themeColor="text1"/>
           <w:sz w:val="24"/>
           <w:szCs w:val="24"/>
         </w:rPr>
       </w:pPr>
-    </w:p>
-    <w:p>
-      <w:pPr>
-        <w:widowControl w:val="0"/>
-        <w:spacing w:after="0" w:line="360" w:lineRule="auto"/>
-        <w:jc w:val="both"/>
-        <w:rPr>
-          <w:rFonts w:cs="Hemi Head 426"/>
-          <w:color w:val="000000"/>
-        </w:rPr>
-      </w:pPr>
-      <w:proofErr w:type="spellStart"/>
-      <w:proofErr w:type="spellEnd"/>
-      <w:r>
-        <w:rPr>
-          <w:b w:val="0"/>
-        </w:rPr>
-        <w:t xml:space="preserve">Eu, </w:t>
-      </w:r>
-      <w:r>
-        <w:rPr>
-          <w:b/>
-        </w:rPr>
-        <w:t>{fornecedor_nome}</w:t>
-      </w:r>
-      <w:r>
-        <w:rPr>
-          <w:b w:val="0"/>
-        </w:rPr>
-        <w:t xml:space="preserve"> portador RG nº </w:t>
-      </w:r>
-      <w:r>
-        <w:rPr>
-          <w:b/>
-        </w:rPr>
-        <w:t>{fornecedor_rg}</w:t>
-      </w:r>
-      <w:r>
-        <w:rPr>
-          <w:b w:val="0"/>
-        </w:rPr>
-        <w:t xml:space="preserve"> SSP/SP e Do CPF nº </w:t>
-      </w:r>
-      <w:r>
-        <w:rPr>
-          <w:b/>
-        </w:rPr>
-        <w:t>{fornecedor_cpf}</w:t>
-      </w:r>
-      <w:r>
-        <w:rPr>
-          <w:b w:val="0"/>
-        </w:rPr>
-        <w:t xml:space="preserve">   Residente e domiciliado à av / rua: </w:t>
-      </w:r>
-      <w:r>
-        <w:rPr>
-          <w:b/>
-        </w:rPr>
-        <w:t>{fornecedor_rua}</w:t>
-      </w:r>
-      <w:r>
-        <w:rPr>
-          <w:b w:val="0"/>
-        </w:rPr>
-        <w:t xml:space="preserve"> nº </w:t>
-      </w:r>
-      <w:r>
-        <w:rPr>
-          <w:b/>
-        </w:rPr>
-        <w:t>{fornecedor_numero}</w:t>
-      </w:r>
-      <w:r>
-        <w:rPr>
-          <w:b w:val="0"/>
-        </w:rPr>
-        <w:t xml:space="preserve">  Bairro: </w:t>
-      </w:r>
-      <w:r>
-        <w:rPr>
-          <w:b/>
-        </w:rPr>
-        <w:t>{fornecedor_bairro}</w:t>
-      </w:r>
-      <w:r>
-        <w:rPr>
-          <w:b w:val="0"/>
-        </w:rPr>
-        <w:t xml:space="preserve">  na Cidade de </w:t>
-      </w:r>
-      <w:r>
-        <w:rPr>
-          <w:b/>
-        </w:rPr>
-        <w:t>{fornecedor_cidade}</w:t>
-      </w:r>
-      <w:r>
-        <w:rPr>
-          <w:b w:val="0"/>
-        </w:rPr>
-        <w:t xml:space="preserve"> - </w:t>
-      </w:r>
-      <w:r>
-        <w:rPr>
-          <w:b/>
-        </w:rPr>
-        <w:t>{fornecedor_estado}</w:t>
-      </w:r>
-      <w:r>
-        <w:rPr>
-          <w:b w:val="0"/>
-        </w:rPr>
-        <w:t xml:space="preserve">      CEP </w:t>
-      </w:r>
-      <w:r>
-        <w:rPr>
-          <w:b/>
-        </w:rPr>
-        <w:t>{fornecedor_cep}</w:t>
-      </w:r>
-      <w:r>
-        <w:rPr>
-          <w:b w:val="0"/>
-        </w:rPr>
-        <w:t xml:space="preserve"> telefone </w:t>
-      </w:r>
-      <w:r>
-        <w:rPr>
-          <w:b/>
-        </w:rPr>
-        <w:t>{fornecedor_telefone}</w:t>
-      </w:r>
-      <w:r>
-        <w:rPr>
-          <w:b w:val="0"/>
-        </w:rPr>
-        <w:t xml:space="preserve"> Neste ato denominado simplesmente Como </w:t>
-      </w:r>
-      <w:r>
-        <w:rPr>
-          <w:b/>
-        </w:rPr>
-        <w:t>VENDEDOR</w:t>
-      </w:r>
-      <w:r>
-        <w:rPr>
-          <w:b w:val="0"/>
-        </w:rPr>
-        <w:t xml:space="preserve">, declaro ter recebido o valor de R$ </w:t>
-      </w:r>
-      <w:r>
-        <w:rPr>
-          <w:b/>
-        </w:rPr>
-        <w:t>{valor_compra_extenso}</w:t>
-      </w:r>
-      <w:r>
-        <w:rPr>
-          <w:b w:val="0"/>
-        </w:rPr>
-        <w:t xml:space="preserve"> ( </w:t>
-      </w:r>
-      <w:r>
-        <w:rPr>
-          <w:b/>
-        </w:rPr>
-        <w:t>{valor_compra}</w:t>
-      </w:r>
-      <w:r>
-        <w:rPr>
-          <w:b w:val="0"/>
-        </w:rPr>
-        <w:t xml:space="preserve"> ) referente venda do Veículo marca / modelo </w:t>
-      </w:r>
-      <w:r>
-        <w:rPr>
-          <w:b/>
-        </w:rPr>
-        <w:t>{moto_marca_modelo}</w:t>
-      </w:r>
-      <w:r>
-        <w:rPr>
-          <w:b w:val="0"/>
-        </w:rPr>
-        <w:t xml:space="preserve"> com Placa: </w:t>
-      </w:r>
-      <w:r>
-        <w:rPr>
-          <w:b/>
-        </w:rPr>
-        <w:t>{moto_placa}</w:t>
-      </w:r>
-      <w:r>
-        <w:rPr>
-          <w:b w:val="0"/>
-        </w:rPr>
-        <w:t xml:space="preserve"> de cor: </w:t>
-      </w:r>
-      <w:r>
-        <w:rPr>
-          <w:b/>
-        </w:rPr>
-        <w:t>{moto_cor}</w:t>
-      </w:r>
-      <w:r>
-        <w:rPr>
-          <w:b w:val="0"/>
-        </w:rPr>
-        <w:t xml:space="preserve"> RENAVAM: </w:t>
-      </w:r>
-      <w:r>
-        <w:rPr>
-          <w:b/>
-        </w:rPr>
-        <w:t>{moto_renavam}</w:t>
-      </w:r>
-      <w:r>
-        <w:rPr>
-          <w:b w:val="0"/>
-        </w:rPr>
-        <w:t xml:space="preserve"> CHASSI: </w:t>
-      </w:r>
-      <w:r>
-        <w:rPr>
-          <w:b/>
-        </w:rPr>
-        <w:t>{moto_chassi}</w:t>
-      </w:r>
-    </w:p>
-    <w:p>
-      <w:pPr>
-        <w:widowControl w:val="0"/>
-        <w:spacing w:after="0" w:line="360" w:lineRule="auto"/>
-        <w:jc w:val="both"/>
-        <w:rPr>
-          <w:rFonts w:cs="Hemi Head 426"/>
-          <w:b/>
-          <w:color w:val="000000"/>
-        </w:rPr>
-      </w:pPr>
-      <w:r>
-        <w:rPr>
-          <w:b w:val="0"/>
-        </w:rPr>
-        <w:t xml:space="preserve">Ano de fabricação / modelo </w:t>
-      </w:r>
-      <w:r>
-        <w:rPr>
-          <w:b/>
-        </w:rPr>
-        <w:t>{moto_ano_fabricacao}</w:t>
-      </w:r>
-      <w:r>
-        <w:rPr>
-          <w:b w:val="0"/>
-        </w:rPr>
-        <w:t xml:space="preserve"> / </w:t>
-      </w:r>
-      <w:r>
-        <w:rPr>
-          <w:b/>
-        </w:rPr>
-        <w:t>{moto_ano_modelo}</w:t>
-      </w:r>
-      <w:r>
-        <w:rPr>
-          <w:b w:val="0"/>
-        </w:rPr>
-        <w:t xml:space="preserve">         KM: </w:t>
-      </w:r>
-      <w:r>
-        <w:rPr>
-          <w:b/>
-        </w:rPr>
-        <w:t>{moto_km}</w:t>
-      </w:r>
-    </w:p>
-    <w:p>
-      <w:pPr>
-        <w:widowControl w:val="0"/>
-        <w:spacing w:after="0" w:line="360" w:lineRule="auto"/>
-        <w:jc w:val="both"/>
-        <w:rPr>
-          <w:rFonts w:cs="Hemi Head 426"/>
-          <w:color w:val="000000"/>
-        </w:rPr>
-      </w:pPr>
-    </w:p>
-    <w:p>
-      <w:pPr>
-        <w:widowControl w:val="0"/>
-        <w:spacing w:after="0" w:line="360" w:lineRule="auto"/>
-        <w:jc w:val="both"/>
-        <w:rPr>
-          <w:color w:val="000000" w:themeColor="text1"/>
-          <w:sz w:val="24"/>
-          <w:szCs w:val="24"/>
-        </w:rPr>
-      </w:pPr>
-      <w:proofErr w:type="gramStart"/>
-      <w:proofErr w:type="gramEnd"/>
-      <w:r>
-        <w:rPr>
-          <w:b/>
-        </w:rPr>
-        <w:t>Observação:</w:t>
-      </w:r>
-      <w:r>
-        <w:rPr>
-          <w:b w:val="0"/>
-        </w:rPr>
-        <w:t xml:space="preserve"> </w:t>
-      </w:r>
-      <w:r>
-        <w:rPr>
-          <w:b/>
-        </w:rPr>
-        <w:t>{observacoes}</w:t>
-      </w:r>
-      <w:r>
-        <w:rPr>
-          <w:b w:val="0"/>
-        </w:rPr>
-        <w:t>.</w:t>
-      </w:r>
-    </w:p>
-    <w:p>
-      <w:pPr>
-        <w:widowControl w:val="0"/>
-        <w:spacing w:after="0" w:line="240" w:lineRule="auto"/>
+      <w:r>
+        <w:rPr>
+          <w:rFonts w:ascii="Arial" w:hAnsi="Arial" w:eastAsia="Arial" w:cs="Arial"/>
+          <w:sz w:val="4"/>
+        </w:rPr>
+      </w:r>
+    </w:p>
+    <w:p>
+      <w:pPr>
+        <w:widowControl w:val="0"/>
+        <w:spacing w:after="0" w:line="40" w:lineRule="exact" w:before="0"/>
         <w:jc w:val="both"/>
         <w:rPr>
           <w:color w:val="000000" w:themeColor="text1"/>
@@ -585,11 +857,17 @@
           <w:szCs w:val="16"/>
         </w:rPr>
       </w:pPr>
-    </w:p>
-    <w:p>
-      <w:pPr>
-        <w:widowControl w:val="0"/>
-        <w:spacing w:after="0" w:line="240" w:lineRule="auto"/>
+      <w:r>
+        <w:rPr>
+          <w:rFonts w:ascii="Arial" w:hAnsi="Arial" w:eastAsia="Arial" w:cs="Arial"/>
+          <w:sz w:val="4"/>
+        </w:rPr>
+      </w:r>
+    </w:p>
+    <w:p>
+      <w:pPr>
+        <w:widowControl w:val="0"/>
+        <w:spacing w:after="0" w:line="40" w:lineRule="exact" w:before="0"/>
         <w:jc w:val="both"/>
         <w:rPr>
           <w:color w:val="000000" w:themeColor="text1"/>
@@ -597,11 +875,17 @@
           <w:szCs w:val="16"/>
         </w:rPr>
       </w:pPr>
-    </w:p>
-    <w:p>
-      <w:pPr>
-        <w:widowControl w:val="0"/>
-        <w:spacing w:after="0" w:line="240" w:lineRule="auto"/>
+      <w:r>
+        <w:rPr>
+          <w:rFonts w:ascii="Arial" w:hAnsi="Arial" w:eastAsia="Arial" w:cs="Arial"/>
+          <w:sz w:val="4"/>
+        </w:rPr>
+      </w:r>
+    </w:p>
+    <w:p>
+      <w:pPr>
+        <w:widowControl w:val="0"/>
+        <w:spacing w:after="0" w:line="40" w:lineRule="exact" w:before="0"/>
         <w:jc w:val="both"/>
         <w:rPr>
           <w:color w:val="000000" w:themeColor="text1"/>
@@ -609,11 +893,17 @@
           <w:szCs w:val="16"/>
         </w:rPr>
       </w:pPr>
-    </w:p>
-    <w:p>
-      <w:pPr>
-        <w:widowControl w:val="0"/>
-        <w:spacing w:after="0" w:line="240" w:lineRule="auto"/>
+      <w:r>
+        <w:rPr>
+          <w:rFonts w:ascii="Arial" w:hAnsi="Arial" w:eastAsia="Arial" w:cs="Arial"/>
+          <w:sz w:val="4"/>
+        </w:rPr>
+      </w:r>
+    </w:p>
+    <w:p>
+      <w:pPr>
+        <w:widowControl w:val="0"/>
+        <w:spacing w:after="0" w:line="40" w:lineRule="exact" w:before="0"/>
         <w:jc w:val="both"/>
         <w:rPr>
           <w:color w:val="000000" w:themeColor="text1"/>
@@ -621,185 +911,17 @@
           <w:szCs w:val="16"/>
         </w:rPr>
       </w:pPr>
-    </w:p>
-    <w:p>
-      <w:pPr>
-        <w:widowControl w:val="0"/>
-        <w:spacing w:after="0" w:line="240" w:lineRule="auto"/>
-        <w:jc w:val="both"/>
-        <w:rPr>
-          <w:color w:val="000000" w:themeColor="text1"/>
-          <w:sz w:val="16"/>
-          <w:szCs w:val="16"/>
-        </w:rPr>
-      </w:pPr>
-    </w:p>
-    <w:p>
-      <w:pPr>
-        <w:widowControl w:val="0"/>
-        <w:spacing w:after="0" w:line="240" w:lineRule="auto"/>
-        <w:jc w:val="both"/>
-        <w:rPr>
-          <w:color w:val="000000" w:themeColor="text1"/>
-          <w:sz w:val="24"/>
-          <w:szCs w:val="24"/>
-        </w:rPr>
-      </w:pPr>
-      <w:r>
-        <w:rPr>
-          <w:color w:val="000000" w:themeColor="text1"/>
-          <w:sz w:val="24"/>
-          <w:szCs w:val="24"/>
-        </w:rPr>
-        <w:t xml:space="preserve">O </w:t>
-      </w:r>
-      <w:r>
-        <w:rPr>
-          <w:b/>
-          <w:color w:val="000000" w:themeColor="text1"/>
-          <w:sz w:val="24"/>
-          <w:szCs w:val="24"/>
-        </w:rPr>
-        <w:t>VENDEDOR</w:t>
-      </w:r>
-      <w:r>
-        <w:rPr>
-          <w:color w:val="000000" w:themeColor="text1"/>
-          <w:sz w:val="24"/>
-          <w:szCs w:val="24"/>
-        </w:rPr>
-        <w:t xml:space="preserve"> fica ciente de sua responsabilidade civil e criminal quanto ao veículo acima descrito.</w:t>
-      </w:r>
-    </w:p>
-    <w:p>
-      <w:pPr>
-        <w:widowControl w:val="0"/>
-        <w:spacing w:after="0" w:line="240" w:lineRule="auto"/>
-        <w:jc w:val="both"/>
-        <w:rPr>
-          <w:color w:val="000000" w:themeColor="text1"/>
-          <w:sz w:val="16"/>
-          <w:szCs w:val="16"/>
-        </w:rPr>
-      </w:pPr>
-    </w:p>
-    <w:p>
-      <w:pPr>
-        <w:widowControl w:val="0"/>
-        <w:spacing w:after="0" w:line="240" w:lineRule="auto"/>
-        <w:jc w:val="both"/>
-        <w:rPr>
-          <w:color w:val="000000" w:themeColor="text1"/>
-          <w:sz w:val="24"/>
-          <w:szCs w:val="24"/>
-        </w:rPr>
-      </w:pPr>
-      <w:r>
-        <w:rPr>
-          <w:color w:val="000000" w:themeColor="text1"/>
-          <w:sz w:val="24"/>
-          <w:szCs w:val="24"/>
-        </w:rPr>
-        <w:t xml:space="preserve">É também responsabilidade do </w:t>
-      </w:r>
-      <w:r>
-        <w:rPr>
-          <w:b/>
-          <w:color w:val="000000" w:themeColor="text1"/>
-          <w:sz w:val="24"/>
-          <w:szCs w:val="24"/>
-        </w:rPr>
-        <w:t>VENDEDOR</w:t>
-      </w:r>
-      <w:r>
-        <w:rPr>
-          <w:color w:val="000000" w:themeColor="text1"/>
-          <w:sz w:val="24"/>
-          <w:szCs w:val="24"/>
-        </w:rPr>
-        <w:t xml:space="preserve"> multas e débitos existente</w:t>
-      </w:r>
-      <w:r>
-        <w:rPr>
-          <w:color w:val="000000" w:themeColor="text1"/>
-          <w:sz w:val="24"/>
-          <w:szCs w:val="24"/>
-        </w:rPr>
-        <w:t>s</w:t>
-      </w:r>
-      <w:r>
-        <w:rPr>
-          <w:color w:val="000000" w:themeColor="text1"/>
-          <w:sz w:val="24"/>
-          <w:szCs w:val="24"/>
-        </w:rPr>
-        <w:t xml:space="preserve"> até a presente data, salvo aquelas acordadas entre as partes.</w:t>
-      </w:r>
-    </w:p>
-    <w:p>
-      <w:pPr>
-        <w:widowControl w:val="0"/>
-        <w:spacing w:after="0" w:line="240" w:lineRule="auto"/>
-        <w:jc w:val="both"/>
-        <w:rPr>
-          <w:color w:val="000000" w:themeColor="text1"/>
-          <w:sz w:val="24"/>
-          <w:szCs w:val="24"/>
-        </w:rPr>
-      </w:pPr>
-    </w:p>
-    <w:p>
-      <w:pPr>
-        <w:widowControl w:val="0"/>
-        <w:spacing w:after="0" w:line="240" w:lineRule="auto"/>
-        <w:jc w:val="both"/>
-        <w:rPr>
-          <w:color w:val="000000" w:themeColor="text1"/>
-          <w:sz w:val="16"/>
-          <w:szCs w:val="16"/>
-        </w:rPr>
-      </w:pPr>
-    </w:p>
-    <w:p>
-      <w:pPr>
-        <w:widowControl w:val="0"/>
-        <w:spacing w:after="0" w:line="240" w:lineRule="auto"/>
-        <w:jc w:val="both"/>
-        <w:rPr>
-          <w:color w:val="000000" w:themeColor="text1"/>
-          <w:sz w:val="16"/>
-          <w:szCs w:val="16"/>
-        </w:rPr>
-      </w:pPr>
-    </w:p>
-    <w:p>
-      <w:pPr>
-        <w:widowControl w:val="0"/>
-        <w:spacing w:after="0" w:line="240" w:lineRule="auto"/>
-        <w:jc w:val="both"/>
-        <w:rPr>
-          <w:color w:val="000000" w:themeColor="text1"/>
-          <w:sz w:val="16"/>
-          <w:szCs w:val="16"/>
-        </w:rPr>
-      </w:pPr>
-    </w:p>
-    <w:p>
-      <w:pPr>
-        <w:widowControl w:val="0"/>
-        <w:spacing w:after="0" w:line="240" w:lineRule="auto"/>
-        <w:jc w:val="both"/>
-        <w:rPr>
-          <w:color w:val="000000" w:themeColor="text1"/>
-          <w:sz w:val="16"/>
-          <w:szCs w:val="16"/>
-        </w:rPr>
-      </w:pPr>
-    </w:p>
-    <w:p>
-      <w:pPr>
-        <w:widowControl w:val="0"/>
-        <w:spacing w:after="0" w:line="240" w:lineRule="auto"/>
+      <w:r>
+        <w:rPr>
+          <w:rFonts w:ascii="Arial" w:hAnsi="Arial" w:eastAsia="Arial" w:cs="Arial"/>
+          <w:sz w:val="4"/>
+        </w:rPr>
+      </w:r>
+    </w:p>
+    <w:p>
+      <w:pPr>
+        <w:widowControl w:val="0"/>
+        <w:spacing w:after="840" w:line="259" w:lineRule="auto" w:before="0"/>
         <w:jc w:val="both"/>
         <w:rPr>
           <w:color w:val="000000"/>
@@ -813,31 +935,41 @@
       <w:proofErr w:type="spellEnd"/>
       <w:r>
         <w:rPr>
-          <w:b w:val="0"/>
+          <w:rFonts w:ascii="Arial" w:hAnsi="Arial" w:eastAsia="Arial" w:cs="Arial"/>
+          <w:b w:val="0"/>
+          <w:sz w:val="20"/>
         </w:rPr>
         <w:t xml:space="preserve">SÃO JOSÉ DOS CAMPOS      </w:t>
       </w:r>
       <w:r>
         <w:rPr>
-          <w:b/>
+          <w:rFonts w:ascii="Arial" w:hAnsi="Arial" w:eastAsia="Arial" w:cs="Arial"/>
+          <w:b/>
+          <w:sz w:val="20"/>
         </w:rPr>
         <w:t>{data_extenso}</w:t>
       </w:r>
       <w:r>
         <w:rPr>
-          <w:b w:val="0"/>
+          <w:rFonts w:ascii="Arial" w:hAnsi="Arial" w:eastAsia="Arial" w:cs="Arial"/>
+          <w:b w:val="0"/>
+          <w:sz w:val="20"/>
         </w:rPr>
         <w:t xml:space="preserve">      Ás     </w:t>
       </w:r>
       <w:r>
         <w:rPr>
-          <w:b/>
+          <w:rFonts w:ascii="Arial" w:hAnsi="Arial" w:eastAsia="Arial" w:cs="Arial"/>
+          <w:b/>
+          <w:sz w:val="20"/>
         </w:rPr>
         <w:t>{hora_documento}</w:t>
       </w:r>
       <w:r>
         <w:rPr>
-          <w:b w:val="0"/>
+          <w:rFonts w:ascii="Arial" w:hAnsi="Arial" w:eastAsia="Arial" w:cs="Arial"/>
+          <w:b w:val="0"/>
+          <w:sz w:val="20"/>
         </w:rPr>
         <w:t xml:space="preserve">     hs.</w:t>
       </w:r>
@@ -845,7 +977,7 @@
     <w:p>
       <w:pPr>
         <w:widowControl w:val="0"/>
-        <w:spacing w:after="0" w:line="240" w:lineRule="auto"/>
+        <w:spacing w:after="0" w:line="40" w:lineRule="exact" w:before="0"/>
         <w:jc w:val="both"/>
         <w:rPr>
           <w:color w:val="000000"/>
@@ -853,7 +985,9 @@
       </w:pPr>
       <w:r>
         <w:rPr>
+          <w:rFonts w:ascii="Arial" w:hAnsi="Arial" w:eastAsia="Arial" w:cs="Arial"/>
           <w:color w:val="000000"/>
+          <w:sz w:val="4"/>
         </w:rPr>
         <w:t xml:space="preserve"> </w:t>
       </w:r>
@@ -861,135 +995,261 @@
     <w:p>
       <w:pPr>
         <w:widowControl w:val="0"/>
-        <w:spacing w:after="0" w:line="240" w:lineRule="auto"/>
+        <w:spacing w:after="0" w:line="40" w:lineRule="exact" w:before="0"/>
         <w:jc w:val="both"/>
         <w:rPr>
           <w:color w:val="000000"/>
         </w:rPr>
       </w:pPr>
-    </w:p>
-    <w:p>
-      <w:pPr>
-        <w:widowControl w:val="0"/>
-        <w:spacing w:after="0" w:line="240" w:lineRule="auto"/>
+      <w:r>
+        <w:rPr>
+          <w:rFonts w:ascii="Arial" w:hAnsi="Arial" w:eastAsia="Arial" w:cs="Arial"/>
+          <w:sz w:val="4"/>
+        </w:rPr>
+      </w:r>
+    </w:p>
+    <w:p>
+      <w:pPr>
+        <w:widowControl w:val="0"/>
+        <w:spacing w:after="0" w:line="40" w:lineRule="exact" w:before="0"/>
         <w:jc w:val="both"/>
         <w:rPr>
           <w:color w:val="000000"/>
         </w:rPr>
       </w:pPr>
-    </w:p>
-    <w:p>
-      <w:pPr>
-        <w:widowControl w:val="0"/>
-        <w:spacing w:after="0" w:line="240" w:lineRule="auto"/>
+      <w:r>
+        <w:rPr>
+          <w:rFonts w:ascii="Arial" w:hAnsi="Arial" w:eastAsia="Arial" w:cs="Arial"/>
+          <w:sz w:val="4"/>
+        </w:rPr>
+      </w:r>
+    </w:p>
+    <w:p>
+      <w:pPr>
+        <w:widowControl w:val="0"/>
+        <w:spacing w:after="0" w:line="40" w:lineRule="exact" w:before="0"/>
         <w:jc w:val="both"/>
         <w:rPr>
           <w:color w:val="000000"/>
         </w:rPr>
       </w:pPr>
-    </w:p>
-    <w:p>
-      <w:pPr>
-        <w:widowControl w:val="0"/>
-        <w:spacing w:after="0" w:line="240" w:lineRule="auto"/>
+      <w:r>
+        <w:rPr>
+          <w:rFonts w:ascii="Arial" w:hAnsi="Arial" w:eastAsia="Arial" w:cs="Arial"/>
+          <w:sz w:val="4"/>
+        </w:rPr>
+      </w:r>
+    </w:p>
+    <w:p>
+      <w:pPr>
+        <w:widowControl w:val="0"/>
+        <w:spacing w:after="0" w:line="40" w:lineRule="exact" w:before="0"/>
         <w:jc w:val="both"/>
         <w:rPr>
           <w:color w:val="000000"/>
         </w:rPr>
       </w:pPr>
-    </w:p>
-    <w:p>
-      <w:pPr>
-        <w:widowControl w:val="0"/>
-        <w:spacing w:after="0" w:line="240" w:lineRule="auto"/>
+      <w:r>
+        <w:rPr>
+          <w:rFonts w:ascii="Arial" w:hAnsi="Arial" w:eastAsia="Arial" w:cs="Arial"/>
+          <w:sz w:val="4"/>
+        </w:rPr>
+      </w:r>
+    </w:p>
+    <w:p>
+      <w:pPr>
+        <w:widowControl w:val="0"/>
+        <w:spacing w:after="0" w:line="40" w:lineRule="exact" w:before="0"/>
         <w:jc w:val="both"/>
         <w:rPr>
           <w:color w:val="000000"/>
         </w:rPr>
       </w:pPr>
-    </w:p>
-    <w:p>
-      <w:pPr>
-        <w:widowControl w:val="0"/>
-        <w:spacing w:after="0" w:line="240" w:lineRule="auto"/>
-        <w:jc w:val="both"/>
-        <w:rPr>
-          <w:color w:val="000000"/>
-        </w:rPr>
-      </w:pPr>
-      <w:r>
-        <w:rPr>
-          <w:color w:val="000000"/>
-        </w:rPr>
-        <w:t>_____________________________________</w:t>
-      </w:r>
-      <w:r>
-        <w:rPr>
-          <w:color w:val="000000"/>
-        </w:rPr>
-        <w:tab/>
-      </w:r>
-      <w:r>
-        <w:rPr>
-          <w:color w:val="000000"/>
-        </w:rPr>
-        <w:tab/>
-        <w:t>________________________________________</w:t>
-      </w:r>
-    </w:p>
-    <w:p>
-      <w:pPr>
-        <w:widowControl w:val="0"/>
-        <w:spacing w:after="0" w:line="240" w:lineRule="auto"/>
-        <w:jc w:val="both"/>
-        <w:rPr>
-          <w:color w:val="000000"/>
-        </w:rPr>
-      </w:pPr>
-      <w:r>
-        <w:rPr>
-          <w:b/>
-          <w:color w:val="000000"/>
-        </w:rPr>
-        <w:t>BLACKOUT MOTOS</w:t>
-      </w:r>
-      <w:r>
-        <w:rPr>
-          <w:b/>
-          <w:color w:val="000000"/>
-        </w:rPr>
-        <w:tab/>
-      </w:r>
-      <w:r>
-        <w:rPr>
-          <w:b/>
-          <w:color w:val="000000"/>
-        </w:rPr>
-        <w:tab/>
-      </w:r>
-      <w:r>
-        <w:rPr>
-          <w:b/>
-          <w:color w:val="000000"/>
-        </w:rPr>
-        <w:tab/>
-      </w:r>
-      <w:r>
-        <w:rPr>
-          <w:b/>
-          <w:color w:val="000000"/>
-        </w:rPr>
-        <w:tab/>
-      </w:r>
-      <w:r>
-        <w:rPr>
-          <w:b/>
-          <w:color w:val="000000"/>
-        </w:rPr>
-        <w:tab/>
-        <w:t>VENDEDOR</w:t>
-      </w:r>
-    </w:p>
+      <w:r>
+        <w:rPr>
+          <w:rFonts w:ascii="Arial" w:hAnsi="Arial" w:eastAsia="Arial" w:cs="Arial"/>
+          <w:sz w:val="4"/>
+        </w:rPr>
+      </w:r>
+    </w:p>
+    <w:p>
+      <w:pPr>
+        <w:spacing w:before="120" w:after="0" w:line="240" w:lineRule="auto"/>
+      </w:pPr>
+      <w:r>
+        <w:rPr>
+          <w:rFonts w:ascii="Arial" w:hAnsi="Arial" w:eastAsia="Arial"/>
+          <w:sz w:val="8"/>
+        </w:rPr>
+      </w:r>
+    </w:p>
+    <w:tbl>
+      <w:tblPr>
+        <w:tblW w:type="auto" w:w="0"/>
+        <w:jc w:val="center"/>
+        <w:tblLayout w:type="fixed"/>
+        <w:tblLook w:firstColumn="1" w:firstRow="1" w:lastColumn="0" w:lastRow="0" w:noHBand="0" w:noVBand="1" w:val="04A0"/>
+        <w:tblBorders>
+          <w:top w:val="nil"/>
+          <w:left w:val="nil"/>
+          <w:bottom w:val="nil"/>
+          <w:right w:val="nil"/>
+          <w:insideH w:val="nil"/>
+          <w:insideV w:val="nil"/>
+        </w:tblBorders>
+      </w:tblPr>
+      <w:tblGrid>
+        <w:gridCol w:w="3402"/>
+        <w:gridCol w:w="3402"/>
+        <w:gridCol w:w="3402"/>
+      </w:tblGrid>
+      <w:tr>
+        <w:tc>
+          <w:tcPr>
+            <w:tcW w:type="dxa" w:w="3969"/>
+            <w:vAlign w:val="center"/>
+            <w:tcMar>
+              <w:top w:w="0" w:type="dxa"/>
+              <w:start w:w="0" w:type="dxa"/>
+              <w:bottom w:w="0" w:type="dxa"/>
+              <w:end w:w="0" w:type="dxa"/>
+            </w:tcMar>
+          </w:tcPr>
+          <w:p>
+            <w:pPr>
+              <w:spacing w:before="0" w:after="100" w:line="240" w:lineRule="auto"/>
+              <w:jc w:val="center"/>
+            </w:pPr>
+            <w:r>
+              <w:rPr>
+                <w:rFonts w:ascii="Arial" w:hAnsi="Arial" w:eastAsia="Arial"/>
+                <w:b w:val="0"/>
+                <w:sz w:val="20"/>
+              </w:rPr>
+              <w:t>__________________________</w:t>
+            </w:r>
+          </w:p>
+        </w:tc>
+        <w:tc>
+          <w:tcPr>
+            <w:tcW w:type="dxa" w:w="624"/>
+            <w:vAlign w:val="center"/>
+            <w:tcMar>
+              <w:top w:w="0" w:type="dxa"/>
+              <w:start w:w="0" w:type="dxa"/>
+              <w:bottom w:w="0" w:type="dxa"/>
+              <w:end w:w="0" w:type="dxa"/>
+            </w:tcMar>
+          </w:tcPr>
+          <w:p>
+            <w:pPr>
+              <w:spacing w:after="100"/>
+              <w:jc w:val="center"/>
+            </w:pPr>
+            <w:r/>
+          </w:p>
+        </w:tc>
+        <w:tc>
+          <w:tcPr>
+            <w:tcW w:type="dxa" w:w="3969"/>
+            <w:vAlign w:val="center"/>
+            <w:tcMar>
+              <w:top w:w="0" w:type="dxa"/>
+              <w:start w:w="0" w:type="dxa"/>
+              <w:bottom w:w="0" w:type="dxa"/>
+              <w:end w:w="0" w:type="dxa"/>
+            </w:tcMar>
+          </w:tcPr>
+          <w:p>
+            <w:pPr>
+              <w:spacing w:before="0" w:after="100" w:line="240" w:lineRule="auto"/>
+              <w:jc w:val="center"/>
+            </w:pPr>
+            <w:r>
+              <w:rPr>
+                <w:rFonts w:ascii="Arial" w:hAnsi="Arial" w:eastAsia="Arial"/>
+                <w:b w:val="0"/>
+                <w:sz w:val="20"/>
+              </w:rPr>
+              <w:t>__________________________</w:t>
+            </w:r>
+          </w:p>
+        </w:tc>
+      </w:tr>
+      <w:tr>
+        <w:tc>
+          <w:tcPr>
+            <w:tcW w:type="dxa" w:w="3969"/>
+            <w:vAlign w:val="center"/>
+            <w:tcMar>
+              <w:top w:w="0" w:type="dxa"/>
+              <w:start w:w="0" w:type="dxa"/>
+              <w:bottom w:w="0" w:type="dxa"/>
+              <w:end w:w="0" w:type="dxa"/>
+            </w:tcMar>
+          </w:tcPr>
+          <w:p>
+            <w:pPr>
+              <w:spacing w:before="0" w:after="0" w:line="240" w:lineRule="auto"/>
+              <w:jc w:val="center"/>
+            </w:pPr>
+            <w:r>
+              <w:rPr>
+                <w:rFonts w:ascii="Arial" w:hAnsi="Arial" w:eastAsia="Arial"/>
+                <w:b/>
+                <w:sz w:val="20"/>
+              </w:rPr>
+              <w:t>BLACKOUT MOTOS</w:t>
+            </w:r>
+          </w:p>
+        </w:tc>
+        <w:tc>
+          <w:tcPr>
+            <w:tcW w:type="dxa" w:w="624"/>
+            <w:vAlign w:val="center"/>
+            <w:tcMar>
+              <w:top w:w="0" w:type="dxa"/>
+              <w:start w:w="0" w:type="dxa"/>
+              <w:bottom w:w="0" w:type="dxa"/>
+              <w:end w:w="0" w:type="dxa"/>
+            </w:tcMar>
+          </w:tcPr>
+          <w:p>
+            <w:pPr>
+              <w:spacing w:before="0" w:after="0"/>
+              <w:jc w:val="center"/>
+            </w:pPr>
+            <w:r/>
+          </w:p>
+        </w:tc>
+        <w:tc>
+          <w:tcPr>
+            <w:tcW w:type="dxa" w:w="3969"/>
+            <w:vAlign w:val="center"/>
+            <w:tcMar>
+              <w:top w:w="0" w:type="dxa"/>
+              <w:start w:w="0" w:type="dxa"/>
+              <w:bottom w:w="0" w:type="dxa"/>
+              <w:end w:w="0" w:type="dxa"/>
+            </w:tcMar>
+          </w:tcPr>
+          <w:p>
+            <w:pPr>
+              <w:spacing w:before="0" w:after="0" w:line="240" w:lineRule="auto"/>
+              <w:jc w:val="center"/>
+            </w:pPr>
+            <w:r>
+              <w:rPr>
+                <w:rFonts w:ascii="Arial" w:hAnsi="Arial" w:eastAsia="Arial"/>
+                <w:b/>
+                <w:sz w:val="20"/>
+              </w:rPr>
+              <w:t>VENDEDOR</w:t>
+            </w:r>
+          </w:p>
+        </w:tc>
+      </w:tr>
+    </w:tbl>
     <w:sectPr>
       <w:headerReference w:type="even" r:id="rId9"/>
       <w:headerReference w:type="default" r:id="rId10"/>
@@ -997,8 +1257,8 @@
       <w:footerReference w:type="default" r:id="rId12"/>
       <w:headerReference w:type="first" r:id="rId13"/>
       <w:footerReference w:type="first" r:id="rId14"/>
-      <w:pgSz w:w="11850" w:h="16783"/>
-      <w:pgMar w:top="567" w:right="851" w:bottom="567" w:left="1134" w:header="709" w:footer="709" w:gutter="0"/>
+      <w:pgSz w:w="11906" w:h="16838"/>
+      <w:pgMar w:top="567" w:right="850" w:bottom="567" w:left="850" w:header="283" w:footer="283" w:gutter="0"/>
       <w:cols w:space="708"/>
       <w:docGrid w:linePitch="360"/>
     </w:sectPr>
@@ -1597,8 +1857,8 @@
       <w:spacing w:after="200" w:line="276" w:lineRule="auto"/>
     </w:pPr>
     <w:rPr>
-      <w:rFonts w:ascii="Calibri" w:eastAsia="SimSun" w:hAnsi="Calibri" w:cs="Calibri"/>
-      <w:sz w:val="22"/>
+      <w:rFonts w:ascii="Arial" w:eastAsia="Arial" w:hAnsi="Arial" w:cs="Calibri"/>
+      <w:sz w:val="20"/>
       <w:szCs w:val="22"/>
       <w:lang w:eastAsia="zh-CN"/>
     </w:rPr>

</xml_diff>

<commit_message>
Poe os documentos todos em Calibri no mesmo corpo de 10pt
Impresso, o contrato saia com letra de tamanhos diferentes. O
modelo do Word tinha o corpo em 10pt e o cabecalho da loja em
7pt, e a previa ainda somava titulos em 15pt e 13pt - tres
tamanhos numa folha so.

Agora os quatro documentos - venda, compra, procuracao e
recibo - estao em Calibri (Corpo), tudo em 10pt, com o negrito
intacto onde ja existia. O titulo se destaca pelo negrito e
pela centralizacao, como no modelo.

Os trechos vazios que so dao espacamento ficaram como estavam:
engorda-los empurraria a assinatura para a segunda pagina.

A previa passou a usar a mesma fonte do arquivo baixado, entao
o que se ve na tela e o que sai na impressora.

A data tambem saia com o mes em caixa alta no meio da frase.

Co-Authored-By: Claude Opus 5 <noreply@anthropic.com>
Claude-Session: https://claude.ai/code/session_012MYCC1xTUZEDcE2GxQr3mc
</commit_message>
<xml_diff>
--- a/public/templates/contrato-compra.docx
+++ b/public/templates/contrato-compra.docx
@@ -8,7 +8,7 @@
         <w:spacing w:after="20" w:line="240" w:lineRule="auto" w:before="0"/>
         <w:jc w:val="center"/>
         <w:rPr>
-          <w:rFonts w:asciiTheme="minorHAnsi" w:hAnsiTheme="minorHAnsi" w:cs="Hemi Head 426"/>
+          <w:rFonts w:asciiTheme="minorHAnsi" w:eastAsiaTheme="minorHAnsi" w:hAnsiTheme="minorHAnsi" w:cstheme="minorHAnsi"/>
           <w:b/>
           <w:i/>
           <w:color w:val="FF0000"/>
@@ -62,7 +62,7 @@
         <w:spacing w:after="0" w:line="240" w:lineRule="auto" w:before="0"/>
         <w:jc w:val="center"/>
         <w:rPr>
-          <w:rFonts w:asciiTheme="minorHAnsi" w:hAnsiTheme="minorHAnsi" w:cs="Hemi Head 426"/>
+          <w:rFonts w:asciiTheme="minorHAnsi" w:eastAsiaTheme="minorHAnsi" w:hAnsiTheme="minorHAnsi" w:cstheme="minorHAnsi"/>
           <w:i/>
           <w:color w:val="000000" w:themeColor="text1"/>
           <w:sz w:val="16"/>
@@ -76,10 +76,10 @@
       </w:pPr>
       <w:r>
         <w:rPr>
-          <w:rFonts w:ascii="Arial" w:hAnsi="Arial" w:eastAsia="Arial" w:cs="Arial"/>
+          <w:rFonts w:asciiTheme="minorHAnsi" w:eastAsiaTheme="minorHAnsi" w:hAnsiTheme="minorHAnsi" w:cstheme="minorHAnsi"/>
           <w:b w:val="0"/>
           <w:i w:val="0"/>
-          <w:sz w:val="14"/>
+          <w:sz w:val="20"/>
         </w:rPr>
         <w:t>AV: ANDRÔMEDA, 3521 – CEP 12.233-000 – SÃO JOSÉ DOS CAMPOS – SP</w:t>
       </w:r>
@@ -90,7 +90,7 @@
         <w:spacing w:after="0" w:line="240" w:lineRule="auto" w:before="0"/>
         <w:jc w:val="center"/>
         <w:rPr>
-          <w:rFonts w:asciiTheme="minorHAnsi" w:hAnsiTheme="minorHAnsi" w:cs="Hemi Head 426"/>
+          <w:rFonts w:asciiTheme="minorHAnsi" w:eastAsiaTheme="minorHAnsi" w:hAnsiTheme="minorHAnsi" w:cstheme="minorHAnsi"/>
           <w:i/>
           <w:color w:val="000000" w:themeColor="text1"/>
           <w:sz w:val="16"/>
@@ -104,10 +104,10 @@
       </w:pPr>
       <w:r>
         <w:rPr>
-          <w:rFonts w:ascii="Arial" w:hAnsi="Arial" w:eastAsia="Arial" w:cs="Arial"/>
+          <w:rFonts w:asciiTheme="minorHAnsi" w:eastAsiaTheme="minorHAnsi" w:hAnsiTheme="minorHAnsi" w:cstheme="minorHAnsi"/>
           <w:b w:val="0"/>
           <w:i w:val="0"/>
-          <w:sz w:val="14"/>
+          <w:sz w:val="20"/>
         </w:rPr>
         <w:t>TELEFONE: (12) 3917-3777 / (12) 99662-6666</w:t>
       </w:r>
@@ -118,7 +118,7 @@
         <w:spacing w:after="0" w:line="240" w:lineRule="auto" w:before="0"/>
         <w:jc w:val="center"/>
         <w:rPr>
-          <w:rFonts w:asciiTheme="minorHAnsi" w:hAnsiTheme="minorHAnsi" w:cs="Hemi Head 426"/>
+          <w:rFonts w:asciiTheme="minorHAnsi" w:eastAsiaTheme="minorHAnsi" w:hAnsiTheme="minorHAnsi" w:cstheme="minorHAnsi"/>
           <w:i/>
           <w:color w:val="000000" w:themeColor="text1"/>
           <w:sz w:val="16"/>
@@ -132,10 +132,10 @@
       </w:pPr>
       <w:r>
         <w:rPr>
-          <w:rFonts w:ascii="Arial" w:hAnsi="Arial" w:eastAsia="Arial" w:cs="Arial"/>
+          <w:rFonts w:asciiTheme="minorHAnsi" w:eastAsiaTheme="minorHAnsi" w:hAnsiTheme="minorHAnsi" w:cstheme="minorHAnsi"/>
           <w:b w:val="0"/>
           <w:i w:val="0"/>
-          <w:sz w:val="14"/>
+          <w:sz w:val="20"/>
         </w:rPr>
         <w:t>CNPJ: 67.806.748/0001-57</w:t>
       </w:r>
@@ -147,7 +147,7 @@
         <w:spacing w:after="0" w:line="40" w:lineRule="exact" w:before="0"/>
         <w:jc w:val="both"/>
         <w:rPr>
-          <w:rFonts w:asciiTheme="minorHAnsi" w:hAnsiTheme="minorHAnsi" w:cs="Hemi Head 426"/>
+          <w:rFonts w:asciiTheme="minorHAnsi" w:eastAsiaTheme="minorHAnsi" w:hAnsiTheme="minorHAnsi" w:cstheme="minorHAnsi"/>
           <w:color w:val="000000" w:themeColor="text1"/>
           <w:sz w:val="24"/>
           <w:szCs w:val="24"/>
@@ -155,7 +155,7 @@
       </w:pPr>
       <w:r>
         <w:rPr>
-          <w:rFonts w:ascii="Arial" w:hAnsi="Arial" w:eastAsia="Arial" w:cs="Arial"/>
+          <w:rFonts w:asciiTheme="minorHAnsi" w:eastAsiaTheme="minorHAnsi" w:hAnsiTheme="minorHAnsi" w:cstheme="minorHAnsi"/>
           <w:sz w:val="4"/>
         </w:rPr>
       </w:r>
@@ -166,7 +166,7 @@
         <w:spacing w:after="0" w:line="40" w:lineRule="exact" w:before="0"/>
         <w:jc w:val="both"/>
         <w:rPr>
-          <w:rFonts w:asciiTheme="minorHAnsi" w:hAnsiTheme="minorHAnsi" w:cs="Hemi Head 426"/>
+          <w:rFonts w:asciiTheme="minorHAnsi" w:eastAsiaTheme="minorHAnsi" w:hAnsiTheme="minorHAnsi" w:cstheme="minorHAnsi"/>
           <w:color w:val="000000" w:themeColor="text1"/>
           <w:sz w:val="24"/>
           <w:szCs w:val="24"/>
@@ -174,7 +174,7 @@
       </w:pPr>
       <w:r>
         <w:rPr>
-          <w:rFonts w:ascii="Arial" w:hAnsi="Arial" w:eastAsia="Arial" w:cs="Arial"/>
+          <w:rFonts w:asciiTheme="minorHAnsi" w:eastAsiaTheme="minorHAnsi" w:hAnsiTheme="minorHAnsi" w:cstheme="minorHAnsi"/>
           <w:sz w:val="4"/>
         </w:rPr>
       </w:r>
@@ -185,7 +185,7 @@
         <w:spacing w:after="0" w:line="40" w:lineRule="exact" w:before="0"/>
         <w:jc w:val="both"/>
         <w:rPr>
-          <w:rFonts w:asciiTheme="minorHAnsi" w:hAnsiTheme="minorHAnsi" w:cs="Hemi Head 426"/>
+          <w:rFonts w:asciiTheme="minorHAnsi" w:eastAsiaTheme="minorHAnsi" w:hAnsiTheme="minorHAnsi" w:cstheme="minorHAnsi"/>
           <w:color w:val="000000" w:themeColor="text1"/>
           <w:sz w:val="24"/>
           <w:szCs w:val="24"/>
@@ -193,7 +193,7 @@
       </w:pPr>
       <w:r>
         <w:rPr>
-          <w:rFonts w:ascii="Arial" w:hAnsi="Arial" w:eastAsia="Arial" w:cs="Arial"/>
+          <w:rFonts w:asciiTheme="minorHAnsi" w:eastAsiaTheme="minorHAnsi" w:hAnsiTheme="minorHAnsi" w:cstheme="minorHAnsi"/>
           <w:sz w:val="4"/>
         </w:rPr>
       </w:r>
@@ -204,7 +204,7 @@
         <w:spacing w:after="40" w:line="259" w:lineRule="auto" w:before="0"/>
         <w:jc w:val="both"/>
         <w:rPr>
-          <w:rFonts w:cs="Hemi Head 426"/>
+          <w:rFonts w:asciiTheme="minorHAnsi" w:eastAsiaTheme="minorHAnsi" w:hAnsiTheme="minorHAnsi" w:cstheme="minorHAnsi"/>
           <w:color w:val="000000"/>
         </w:rPr>
       </w:pPr>
@@ -212,7 +212,7 @@
       <w:proofErr w:type="spellEnd"/>
       <w:r>
         <w:rPr>
-          <w:rFonts w:ascii="Arial" w:hAnsi="Arial" w:eastAsia="Arial" w:cs="Arial"/>
+          <w:rFonts w:asciiTheme="minorHAnsi" w:eastAsiaTheme="minorHAnsi" w:hAnsiTheme="minorHAnsi" w:cstheme="minorHAnsi"/>
           <w:b w:val="0"/>
           <w:sz w:val="20"/>
         </w:rPr>
@@ -220,7 +220,7 @@
       </w:r>
       <w:r>
         <w:rPr>
-          <w:rFonts w:ascii="Arial" w:hAnsi="Arial" w:eastAsia="Arial" w:cs="Arial"/>
+          <w:rFonts w:asciiTheme="minorHAnsi" w:eastAsiaTheme="minorHAnsi" w:hAnsiTheme="minorHAnsi" w:cstheme="minorHAnsi"/>
           <w:b/>
           <w:sz w:val="20"/>
         </w:rPr>
@@ -228,7 +228,7 @@
       </w:r>
       <w:r>
         <w:rPr>
-          <w:rFonts w:ascii="Arial" w:hAnsi="Arial" w:eastAsia="Arial" w:cs="Arial"/>
+          <w:rFonts w:asciiTheme="minorHAnsi" w:eastAsiaTheme="minorHAnsi" w:hAnsiTheme="minorHAnsi" w:cstheme="minorHAnsi"/>
           <w:b w:val="0"/>
           <w:sz w:val="20"/>
         </w:rPr>
@@ -236,7 +236,7 @@
       </w:r>
       <w:r>
         <w:rPr>
-          <w:rFonts w:ascii="Arial" w:hAnsi="Arial" w:eastAsia="Arial" w:cs="Arial"/>
+          <w:rFonts w:asciiTheme="minorHAnsi" w:eastAsiaTheme="minorHAnsi" w:hAnsiTheme="minorHAnsi" w:cstheme="minorHAnsi"/>
           <w:b/>
           <w:sz w:val="20"/>
         </w:rPr>
@@ -244,7 +244,7 @@
       </w:r>
       <w:r>
         <w:rPr>
-          <w:rFonts w:ascii="Arial" w:hAnsi="Arial" w:eastAsia="Arial" w:cs="Arial"/>
+          <w:rFonts w:asciiTheme="minorHAnsi" w:eastAsiaTheme="minorHAnsi" w:hAnsiTheme="minorHAnsi" w:cstheme="minorHAnsi"/>
           <w:b w:val="0"/>
           <w:sz w:val="20"/>
         </w:rPr>
@@ -252,7 +252,7 @@
       </w:r>
       <w:r>
         <w:rPr>
-          <w:rFonts w:ascii="Arial" w:hAnsi="Arial" w:eastAsia="Arial" w:cs="Arial"/>
+          <w:rFonts w:asciiTheme="minorHAnsi" w:eastAsiaTheme="minorHAnsi" w:hAnsiTheme="minorHAnsi" w:cstheme="minorHAnsi"/>
           <w:b/>
           <w:sz w:val="20"/>
         </w:rPr>
@@ -260,7 +260,7 @@
       </w:r>
       <w:r>
         <w:rPr>
-          <w:rFonts w:ascii="Arial" w:hAnsi="Arial" w:eastAsia="Arial" w:cs="Arial"/>
+          <w:rFonts w:asciiTheme="minorHAnsi" w:eastAsiaTheme="minorHAnsi" w:hAnsiTheme="minorHAnsi" w:cstheme="minorHAnsi"/>
           <w:b w:val="0"/>
           <w:sz w:val="20"/>
         </w:rPr>
@@ -268,7 +268,7 @@
       </w:r>
       <w:r>
         <w:rPr>
-          <w:rFonts w:ascii="Arial" w:hAnsi="Arial" w:eastAsia="Arial" w:cs="Arial"/>
+          <w:rFonts w:asciiTheme="minorHAnsi" w:eastAsiaTheme="minorHAnsi" w:hAnsiTheme="minorHAnsi" w:cstheme="minorHAnsi"/>
           <w:b/>
           <w:sz w:val="20"/>
         </w:rPr>
@@ -276,7 +276,7 @@
       </w:r>
       <w:r>
         <w:rPr>
-          <w:rFonts w:ascii="Arial" w:hAnsi="Arial" w:eastAsia="Arial" w:cs="Arial"/>
+          <w:rFonts w:asciiTheme="minorHAnsi" w:eastAsiaTheme="minorHAnsi" w:hAnsiTheme="minorHAnsi" w:cstheme="minorHAnsi"/>
           <w:b w:val="0"/>
           <w:sz w:val="20"/>
         </w:rPr>
@@ -284,7 +284,7 @@
       </w:r>
       <w:r>
         <w:rPr>
-          <w:rFonts w:ascii="Arial" w:hAnsi="Arial" w:eastAsia="Arial" w:cs="Arial"/>
+          <w:rFonts w:asciiTheme="minorHAnsi" w:eastAsiaTheme="minorHAnsi" w:hAnsiTheme="minorHAnsi" w:cstheme="minorHAnsi"/>
           <w:b/>
           <w:sz w:val="20"/>
         </w:rPr>
@@ -292,7 +292,7 @@
       </w:r>
       <w:r>
         <w:rPr>
-          <w:rFonts w:ascii="Arial" w:hAnsi="Arial" w:eastAsia="Arial" w:cs="Arial"/>
+          <w:rFonts w:asciiTheme="minorHAnsi" w:eastAsiaTheme="minorHAnsi" w:hAnsiTheme="minorHAnsi" w:cstheme="minorHAnsi"/>
           <w:b w:val="0"/>
           <w:sz w:val="20"/>
         </w:rPr>
@@ -300,7 +300,7 @@
       </w:r>
       <w:r>
         <w:rPr>
-          <w:rFonts w:ascii="Arial" w:hAnsi="Arial" w:eastAsia="Arial" w:cs="Arial"/>
+          <w:rFonts w:asciiTheme="minorHAnsi" w:eastAsiaTheme="minorHAnsi" w:hAnsiTheme="minorHAnsi" w:cstheme="minorHAnsi"/>
           <w:b/>
           <w:sz w:val="20"/>
         </w:rPr>
@@ -308,7 +308,7 @@
       </w:r>
       <w:r>
         <w:rPr>
-          <w:rFonts w:ascii="Arial" w:hAnsi="Arial" w:eastAsia="Arial" w:cs="Arial"/>
+          <w:rFonts w:asciiTheme="minorHAnsi" w:eastAsiaTheme="minorHAnsi" w:hAnsiTheme="minorHAnsi" w:cstheme="minorHAnsi"/>
           <w:b w:val="0"/>
           <w:sz w:val="20"/>
         </w:rPr>
@@ -316,7 +316,7 @@
       </w:r>
       <w:r>
         <w:rPr>
-          <w:rFonts w:ascii="Arial" w:hAnsi="Arial" w:eastAsia="Arial" w:cs="Arial"/>
+          <w:rFonts w:asciiTheme="minorHAnsi" w:eastAsiaTheme="minorHAnsi" w:hAnsiTheme="minorHAnsi" w:cstheme="minorHAnsi"/>
           <w:b/>
           <w:sz w:val="20"/>
         </w:rPr>
@@ -324,7 +324,7 @@
       </w:r>
       <w:r>
         <w:rPr>
-          <w:rFonts w:ascii="Arial" w:hAnsi="Arial" w:eastAsia="Arial" w:cs="Arial"/>
+          <w:rFonts w:asciiTheme="minorHAnsi" w:eastAsiaTheme="minorHAnsi" w:hAnsiTheme="minorHAnsi" w:cstheme="minorHAnsi"/>
           <w:b w:val="0"/>
           <w:sz w:val="20"/>
         </w:rPr>
@@ -332,7 +332,7 @@
       </w:r>
       <w:r>
         <w:rPr>
-          <w:rFonts w:ascii="Arial" w:hAnsi="Arial" w:eastAsia="Arial" w:cs="Arial"/>
+          <w:rFonts w:asciiTheme="minorHAnsi" w:eastAsiaTheme="minorHAnsi" w:hAnsiTheme="minorHAnsi" w:cstheme="minorHAnsi"/>
           <w:b/>
           <w:sz w:val="20"/>
         </w:rPr>
@@ -340,7 +340,7 @@
       </w:r>
       <w:r>
         <w:rPr>
-          <w:rFonts w:ascii="Arial" w:hAnsi="Arial" w:eastAsia="Arial" w:cs="Arial"/>
+          <w:rFonts w:asciiTheme="minorHAnsi" w:eastAsiaTheme="minorHAnsi" w:hAnsiTheme="minorHAnsi" w:cstheme="minorHAnsi"/>
           <w:b w:val="0"/>
           <w:sz w:val="20"/>
         </w:rPr>
@@ -348,7 +348,7 @@
       </w:r>
       <w:r>
         <w:rPr>
-          <w:rFonts w:ascii="Arial" w:hAnsi="Arial" w:eastAsia="Arial" w:cs="Arial"/>
+          <w:rFonts w:asciiTheme="minorHAnsi" w:eastAsiaTheme="minorHAnsi" w:hAnsiTheme="minorHAnsi" w:cstheme="minorHAnsi"/>
           <w:b/>
           <w:sz w:val="20"/>
         </w:rPr>
@@ -356,7 +356,7 @@
       </w:r>
       <w:r>
         <w:rPr>
-          <w:rFonts w:ascii="Arial" w:hAnsi="Arial" w:eastAsia="Arial" w:cs="Arial"/>
+          <w:rFonts w:asciiTheme="minorHAnsi" w:eastAsiaTheme="minorHAnsi" w:hAnsiTheme="minorHAnsi" w:cstheme="minorHAnsi"/>
           <w:b w:val="0"/>
           <w:sz w:val="20"/>
         </w:rPr>
@@ -364,7 +364,7 @@
       </w:r>
       <w:r>
         <w:rPr>
-          <w:rFonts w:ascii="Arial" w:hAnsi="Arial" w:eastAsia="Arial" w:cs="Arial"/>
+          <w:rFonts w:asciiTheme="minorHAnsi" w:eastAsiaTheme="minorHAnsi" w:hAnsiTheme="minorHAnsi" w:cstheme="minorHAnsi"/>
           <w:b/>
           <w:sz w:val="20"/>
         </w:rPr>
@@ -372,7 +372,7 @@
       </w:r>
       <w:r>
         <w:rPr>
-          <w:rFonts w:ascii="Arial" w:hAnsi="Arial" w:eastAsia="Arial" w:cs="Arial"/>
+          <w:rFonts w:asciiTheme="minorHAnsi" w:eastAsiaTheme="minorHAnsi" w:hAnsiTheme="minorHAnsi" w:cstheme="minorHAnsi"/>
           <w:b w:val="0"/>
           <w:sz w:val="20"/>
         </w:rPr>
@@ -380,7 +380,7 @@
       </w:r>
       <w:r>
         <w:rPr>
-          <w:rFonts w:ascii="Arial" w:hAnsi="Arial" w:eastAsia="Arial" w:cs="Arial"/>
+          <w:rFonts w:asciiTheme="minorHAnsi" w:eastAsiaTheme="minorHAnsi" w:hAnsiTheme="minorHAnsi" w:cstheme="minorHAnsi"/>
           <w:b/>
           <w:sz w:val="20"/>
         </w:rPr>
@@ -388,7 +388,7 @@
       </w:r>
       <w:r>
         <w:rPr>
-          <w:rFonts w:ascii="Arial" w:hAnsi="Arial" w:eastAsia="Arial" w:cs="Arial"/>
+          <w:rFonts w:asciiTheme="minorHAnsi" w:eastAsiaTheme="minorHAnsi" w:hAnsiTheme="minorHAnsi" w:cstheme="minorHAnsi"/>
           <w:b w:val="0"/>
           <w:sz w:val="20"/>
         </w:rPr>
@@ -396,7 +396,7 @@
       </w:r>
       <w:r>
         <w:rPr>
-          <w:rFonts w:ascii="Arial" w:hAnsi="Arial" w:eastAsia="Arial" w:cs="Arial"/>
+          <w:rFonts w:asciiTheme="minorHAnsi" w:eastAsiaTheme="minorHAnsi" w:hAnsiTheme="minorHAnsi" w:cstheme="minorHAnsi"/>
           <w:b/>
           <w:sz w:val="20"/>
         </w:rPr>
@@ -404,7 +404,7 @@
       </w:r>
       <w:r>
         <w:rPr>
-          <w:rFonts w:ascii="Arial" w:hAnsi="Arial" w:eastAsia="Arial" w:cs="Arial"/>
+          <w:rFonts w:asciiTheme="minorHAnsi" w:eastAsiaTheme="minorHAnsi" w:hAnsiTheme="minorHAnsi" w:cstheme="minorHAnsi"/>
           <w:b w:val="0"/>
           <w:sz w:val="20"/>
         </w:rPr>
@@ -412,7 +412,7 @@
       </w:r>
       <w:r>
         <w:rPr>
-          <w:rFonts w:ascii="Arial" w:hAnsi="Arial" w:eastAsia="Arial" w:cs="Arial"/>
+          <w:rFonts w:asciiTheme="minorHAnsi" w:eastAsiaTheme="minorHAnsi" w:hAnsiTheme="minorHAnsi" w:cstheme="minorHAnsi"/>
           <w:b/>
           <w:sz w:val="20"/>
         </w:rPr>
@@ -420,7 +420,7 @@
       </w:r>
       <w:r>
         <w:rPr>
-          <w:rFonts w:ascii="Arial" w:hAnsi="Arial" w:eastAsia="Arial" w:cs="Arial"/>
+          <w:rFonts w:asciiTheme="minorHAnsi" w:eastAsiaTheme="minorHAnsi" w:hAnsiTheme="minorHAnsi" w:cstheme="minorHAnsi"/>
           <w:b w:val="0"/>
           <w:sz w:val="20"/>
         </w:rPr>
@@ -428,7 +428,7 @@
       </w:r>
       <w:r>
         <w:rPr>
-          <w:rFonts w:ascii="Arial" w:hAnsi="Arial" w:eastAsia="Arial" w:cs="Arial"/>
+          <w:rFonts w:asciiTheme="minorHAnsi" w:eastAsiaTheme="minorHAnsi" w:hAnsiTheme="minorHAnsi" w:cstheme="minorHAnsi"/>
           <w:b/>
           <w:sz w:val="20"/>
         </w:rPr>
@@ -436,7 +436,7 @@
       </w:r>
       <w:r>
         <w:rPr>
-          <w:rFonts w:ascii="Arial" w:hAnsi="Arial" w:eastAsia="Arial" w:cs="Arial"/>
+          <w:rFonts w:asciiTheme="minorHAnsi" w:eastAsiaTheme="minorHAnsi" w:hAnsiTheme="minorHAnsi" w:cstheme="minorHAnsi"/>
           <w:b w:val="0"/>
           <w:sz w:val="20"/>
         </w:rPr>
@@ -444,7 +444,7 @@
       </w:r>
       <w:r>
         <w:rPr>
-          <w:rFonts w:ascii="Arial" w:hAnsi="Arial" w:eastAsia="Arial" w:cs="Arial"/>
+          <w:rFonts w:asciiTheme="minorHAnsi" w:eastAsiaTheme="minorHAnsi" w:hAnsiTheme="minorHAnsi" w:cstheme="minorHAnsi"/>
           <w:b/>
           <w:sz w:val="20"/>
         </w:rPr>
@@ -452,7 +452,7 @@
       </w:r>
       <w:r>
         <w:rPr>
-          <w:rFonts w:ascii="Arial" w:hAnsi="Arial" w:eastAsia="Arial" w:cs="Arial"/>
+          <w:rFonts w:asciiTheme="minorHAnsi" w:eastAsiaTheme="minorHAnsi" w:hAnsiTheme="minorHAnsi" w:cstheme="minorHAnsi"/>
           <w:b w:val="0"/>
           <w:sz w:val="20"/>
         </w:rPr>
@@ -460,7 +460,7 @@
       </w:r>
       <w:r>
         <w:rPr>
-          <w:rFonts w:ascii="Arial" w:hAnsi="Arial" w:eastAsia="Arial" w:cs="Arial"/>
+          <w:rFonts w:asciiTheme="minorHAnsi" w:eastAsiaTheme="minorHAnsi" w:hAnsiTheme="minorHAnsi" w:cstheme="minorHAnsi"/>
           <w:b/>
           <w:sz w:val="20"/>
         </w:rPr>
@@ -468,7 +468,7 @@
       </w:r>
       <w:r>
         <w:rPr>
-          <w:rFonts w:ascii="Arial" w:hAnsi="Arial" w:eastAsia="Arial" w:cs="Arial"/>
+          <w:rFonts w:asciiTheme="minorHAnsi" w:eastAsiaTheme="minorHAnsi" w:hAnsiTheme="minorHAnsi" w:cstheme="minorHAnsi"/>
           <w:b w:val="0"/>
           <w:sz w:val="20"/>
         </w:rPr>
@@ -476,7 +476,7 @@
       </w:r>
       <w:r>
         <w:rPr>
-          <w:rFonts w:ascii="Arial" w:hAnsi="Arial" w:eastAsia="Arial" w:cs="Arial"/>
+          <w:rFonts w:asciiTheme="minorHAnsi" w:eastAsiaTheme="minorHAnsi" w:hAnsiTheme="minorHAnsi" w:cstheme="minorHAnsi"/>
           <w:b/>
           <w:sz w:val="20"/>
         </w:rPr>
@@ -484,7 +484,7 @@
       </w:r>
       <w:r>
         <w:rPr>
-          <w:rFonts w:ascii="Arial" w:hAnsi="Arial" w:eastAsia="Arial" w:cs="Arial"/>
+          <w:rFonts w:asciiTheme="minorHAnsi" w:eastAsiaTheme="minorHAnsi" w:hAnsiTheme="minorHAnsi" w:cstheme="minorHAnsi"/>
           <w:b w:val="0"/>
           <w:sz w:val="20"/>
         </w:rPr>
@@ -492,7 +492,7 @@
       </w:r>
       <w:r>
         <w:rPr>
-          <w:rFonts w:ascii="Arial" w:hAnsi="Arial" w:eastAsia="Arial" w:cs="Arial"/>
+          <w:rFonts w:asciiTheme="minorHAnsi" w:eastAsiaTheme="minorHAnsi" w:hAnsiTheme="minorHAnsi" w:cstheme="minorHAnsi"/>
           <w:b/>
           <w:sz w:val="20"/>
         </w:rPr>
@@ -505,14 +505,14 @@
         <w:spacing w:after="40" w:line="259" w:lineRule="auto" w:before="0"/>
         <w:jc w:val="both"/>
         <w:rPr>
-          <w:rFonts w:cs="Hemi Head 426"/>
+          <w:rFonts w:asciiTheme="minorHAnsi" w:eastAsiaTheme="minorHAnsi" w:hAnsiTheme="minorHAnsi" w:cstheme="minorHAnsi"/>
           <w:b/>
           <w:color w:val="000000"/>
         </w:rPr>
       </w:pPr>
       <w:r>
         <w:rPr>
-          <w:rFonts w:ascii="Arial" w:hAnsi="Arial" w:eastAsia="Arial" w:cs="Arial"/>
+          <w:rFonts w:asciiTheme="minorHAnsi" w:eastAsiaTheme="minorHAnsi" w:hAnsiTheme="minorHAnsi" w:cstheme="minorHAnsi"/>
           <w:b w:val="0"/>
           <w:sz w:val="20"/>
         </w:rPr>
@@ -520,7 +520,7 @@
       </w:r>
       <w:r>
         <w:rPr>
-          <w:rFonts w:ascii="Arial" w:hAnsi="Arial" w:eastAsia="Arial" w:cs="Arial"/>
+          <w:rFonts w:asciiTheme="minorHAnsi" w:eastAsiaTheme="minorHAnsi" w:hAnsiTheme="minorHAnsi" w:cstheme="minorHAnsi"/>
           <w:b/>
           <w:sz w:val="20"/>
         </w:rPr>
@@ -528,7 +528,7 @@
       </w:r>
       <w:r>
         <w:rPr>
-          <w:rFonts w:ascii="Arial" w:hAnsi="Arial" w:eastAsia="Arial" w:cs="Arial"/>
+          <w:rFonts w:asciiTheme="minorHAnsi" w:eastAsiaTheme="minorHAnsi" w:hAnsiTheme="minorHAnsi" w:cstheme="minorHAnsi"/>
           <w:b w:val="0"/>
           <w:sz w:val="20"/>
         </w:rPr>
@@ -536,7 +536,7 @@
       </w:r>
       <w:r>
         <w:rPr>
-          <w:rFonts w:ascii="Arial" w:hAnsi="Arial" w:eastAsia="Arial" w:cs="Arial"/>
+          <w:rFonts w:asciiTheme="minorHAnsi" w:eastAsiaTheme="minorHAnsi" w:hAnsiTheme="minorHAnsi" w:cstheme="minorHAnsi"/>
           <w:b/>
           <w:sz w:val="20"/>
         </w:rPr>
@@ -544,7 +544,7 @@
       </w:r>
       <w:r>
         <w:rPr>
-          <w:rFonts w:ascii="Arial" w:hAnsi="Arial" w:eastAsia="Arial" w:cs="Arial"/>
+          <w:rFonts w:asciiTheme="minorHAnsi" w:eastAsiaTheme="minorHAnsi" w:hAnsiTheme="minorHAnsi" w:cstheme="minorHAnsi"/>
           <w:b w:val="0"/>
           <w:sz w:val="20"/>
         </w:rPr>
@@ -552,7 +552,7 @@
       </w:r>
       <w:r>
         <w:rPr>
-          <w:rFonts w:ascii="Arial" w:hAnsi="Arial" w:eastAsia="Arial" w:cs="Arial"/>
+          <w:rFonts w:asciiTheme="minorHAnsi" w:eastAsiaTheme="minorHAnsi" w:hAnsiTheme="minorHAnsi" w:cstheme="minorHAnsi"/>
           <w:b/>
           <w:sz w:val="20"/>
         </w:rPr>
@@ -565,13 +565,13 @@
         <w:spacing w:after="0" w:line="40" w:lineRule="exact" w:before="0"/>
         <w:jc w:val="both"/>
         <w:rPr>
-          <w:rFonts w:cs="Hemi Head 426"/>
+          <w:rFonts w:asciiTheme="minorHAnsi" w:eastAsiaTheme="minorHAnsi" w:hAnsiTheme="minorHAnsi" w:cstheme="minorHAnsi"/>
           <w:color w:val="000000"/>
         </w:rPr>
       </w:pPr>
       <w:r>
         <w:rPr>
-          <w:rFonts w:ascii="Arial" w:hAnsi="Arial" w:eastAsia="Arial" w:cs="Arial"/>
+          <w:rFonts w:asciiTheme="minorHAnsi" w:eastAsiaTheme="minorHAnsi" w:hAnsiTheme="minorHAnsi" w:cstheme="minorHAnsi"/>
           <w:sz w:val="4"/>
         </w:rPr>
       </w:r>
@@ -591,7 +591,7 @@
       <w:proofErr w:type="gramEnd"/>
       <w:r>
         <w:rPr>
-          <w:rFonts w:ascii="Arial" w:hAnsi="Arial" w:eastAsia="Arial" w:cs="Arial"/>
+          <w:rFonts w:asciiTheme="minorHAnsi" w:eastAsiaTheme="minorHAnsi" w:hAnsiTheme="minorHAnsi" w:cstheme="minorHAnsi"/>
           <w:b/>
           <w:sz w:val="20"/>
         </w:rPr>
@@ -599,7 +599,7 @@
       </w:r>
       <w:r>
         <w:rPr>
-          <w:rFonts w:ascii="Arial" w:hAnsi="Arial" w:eastAsia="Arial" w:cs="Arial"/>
+          <w:rFonts w:asciiTheme="minorHAnsi" w:eastAsiaTheme="minorHAnsi" w:hAnsiTheme="minorHAnsi" w:cstheme="minorHAnsi"/>
           <w:b w:val="0"/>
           <w:sz w:val="20"/>
         </w:rPr>
@@ -607,7 +607,7 @@
       </w:r>
       <w:r>
         <w:rPr>
-          <w:rFonts w:ascii="Arial" w:hAnsi="Arial" w:eastAsia="Arial" w:cs="Arial"/>
+          <w:rFonts w:asciiTheme="minorHAnsi" w:eastAsiaTheme="minorHAnsi" w:hAnsiTheme="minorHAnsi" w:cstheme="minorHAnsi"/>
           <w:b/>
           <w:sz w:val="20"/>
         </w:rPr>
@@ -615,7 +615,7 @@
       </w:r>
       <w:r>
         <w:rPr>
-          <w:rFonts w:ascii="Arial" w:hAnsi="Arial" w:eastAsia="Arial" w:cs="Arial"/>
+          <w:rFonts w:asciiTheme="minorHAnsi" w:eastAsiaTheme="minorHAnsi" w:hAnsiTheme="minorHAnsi" w:cstheme="minorHAnsi"/>
           <w:b w:val="0"/>
           <w:sz w:val="20"/>
         </w:rPr>
@@ -635,7 +635,7 @@
       </w:pPr>
       <w:r>
         <w:rPr>
-          <w:rFonts w:ascii="Arial" w:hAnsi="Arial" w:eastAsia="Arial" w:cs="Arial"/>
+          <w:rFonts w:asciiTheme="minorHAnsi" w:eastAsiaTheme="minorHAnsi" w:hAnsiTheme="minorHAnsi" w:cstheme="minorHAnsi"/>
           <w:sz w:val="4"/>
         </w:rPr>
       </w:r>
@@ -653,7 +653,7 @@
       </w:pPr>
       <w:r>
         <w:rPr>
-          <w:rFonts w:ascii="Arial" w:hAnsi="Arial" w:eastAsia="Arial" w:cs="Arial"/>
+          <w:rFonts w:asciiTheme="minorHAnsi" w:eastAsiaTheme="minorHAnsi" w:hAnsiTheme="minorHAnsi" w:cstheme="minorHAnsi"/>
           <w:sz w:val="4"/>
         </w:rPr>
       </w:r>
@@ -671,7 +671,7 @@
       </w:pPr>
       <w:r>
         <w:rPr>
-          <w:rFonts w:ascii="Arial" w:hAnsi="Arial" w:eastAsia="Arial" w:cs="Arial"/>
+          <w:rFonts w:asciiTheme="minorHAnsi" w:eastAsiaTheme="minorHAnsi" w:hAnsiTheme="minorHAnsi" w:cstheme="minorHAnsi"/>
           <w:sz w:val="4"/>
         </w:rPr>
       </w:r>
@@ -689,7 +689,7 @@
       </w:pPr>
       <w:r>
         <w:rPr>
-          <w:rFonts w:ascii="Arial" w:hAnsi="Arial" w:eastAsia="Arial" w:cs="Arial"/>
+          <w:rFonts w:asciiTheme="minorHAnsi" w:eastAsiaTheme="minorHAnsi" w:hAnsiTheme="minorHAnsi" w:cstheme="minorHAnsi"/>
           <w:sz w:val="4"/>
         </w:rPr>
       </w:r>
@@ -707,7 +707,7 @@
       </w:pPr>
       <w:r>
         <w:rPr>
-          <w:rFonts w:ascii="Arial" w:hAnsi="Arial" w:eastAsia="Arial" w:cs="Arial"/>
+          <w:rFonts w:asciiTheme="minorHAnsi" w:eastAsiaTheme="minorHAnsi" w:hAnsiTheme="minorHAnsi" w:cstheme="minorHAnsi"/>
           <w:sz w:val="4"/>
         </w:rPr>
       </w:r>
@@ -725,29 +725,29 @@
       </w:pPr>
       <w:r>
         <w:rPr>
-          <w:rFonts w:ascii="Arial" w:hAnsi="Arial" w:eastAsia="Arial" w:cs="Arial"/>
-          <w:color w:val="000000" w:themeColor="text1"/>
-          <w:sz w:val="20"/>
-          <w:szCs w:val="24"/>
+          <w:rFonts w:asciiTheme="minorHAnsi" w:eastAsiaTheme="minorHAnsi" w:hAnsiTheme="minorHAnsi" w:cstheme="minorHAnsi"/>
+          <w:color w:val="000000" w:themeColor="text1"/>
+          <w:sz w:val="20"/>
+          <w:szCs w:val="20"/>
         </w:rPr>
         <w:t xml:space="preserve">O </w:t>
       </w:r>
       <w:r>
         <w:rPr>
-          <w:rFonts w:ascii="Arial" w:hAnsi="Arial" w:eastAsia="Arial" w:cs="Arial"/>
-          <w:b/>
-          <w:color w:val="000000" w:themeColor="text1"/>
-          <w:sz w:val="20"/>
-          <w:szCs w:val="24"/>
+          <w:rFonts w:asciiTheme="minorHAnsi" w:eastAsiaTheme="minorHAnsi" w:hAnsiTheme="minorHAnsi" w:cstheme="minorHAnsi"/>
+          <w:b/>
+          <w:color w:val="000000" w:themeColor="text1"/>
+          <w:sz w:val="20"/>
+          <w:szCs w:val="20"/>
         </w:rPr>
         <w:t>VENDEDOR</w:t>
       </w:r>
       <w:r>
         <w:rPr>
-          <w:rFonts w:ascii="Arial" w:hAnsi="Arial" w:eastAsia="Arial" w:cs="Arial"/>
-          <w:color w:val="000000" w:themeColor="text1"/>
-          <w:sz w:val="20"/>
-          <w:szCs w:val="24"/>
+          <w:rFonts w:asciiTheme="minorHAnsi" w:eastAsiaTheme="minorHAnsi" w:hAnsiTheme="minorHAnsi" w:cstheme="minorHAnsi"/>
+          <w:color w:val="000000" w:themeColor="text1"/>
+          <w:sz w:val="20"/>
+          <w:szCs w:val="20"/>
         </w:rPr>
         <w:t xml:space="preserve"> fica ciente de sua responsabilidade civil e criminal quanto ao veículo acima descrito.</w:t>
       </w:r>
@@ -765,7 +765,7 @@
       </w:pPr>
       <w:r>
         <w:rPr>
-          <w:rFonts w:ascii="Arial" w:hAnsi="Arial" w:eastAsia="Arial" w:cs="Arial"/>
+          <w:rFonts w:asciiTheme="minorHAnsi" w:eastAsiaTheme="minorHAnsi" w:hAnsiTheme="minorHAnsi" w:cstheme="minorHAnsi"/>
           <w:sz w:val="4"/>
         </w:rPr>
       </w:r>
@@ -783,47 +783,47 @@
       </w:pPr>
       <w:r>
         <w:rPr>
-          <w:rFonts w:ascii="Arial" w:hAnsi="Arial" w:eastAsia="Arial" w:cs="Arial"/>
+          <w:rFonts w:asciiTheme="minorHAnsi" w:eastAsiaTheme="minorHAnsi" w:hAnsiTheme="minorHAnsi" w:cstheme="minorHAnsi"/>
+          <w:color w:val="000000" w:themeColor="text1"/>
+          <w:sz w:val="20"/>
+          <w:szCs w:val="20"/>
+        </w:rPr>
+        <w:t xml:space="preserve">É também responsabilidade do </w:t>
+      </w:r>
+      <w:r>
+        <w:rPr>
+          <w:rFonts w:asciiTheme="minorHAnsi" w:eastAsiaTheme="minorHAnsi" w:hAnsiTheme="minorHAnsi" w:cstheme="minorHAnsi"/>
+          <w:b/>
+          <w:color w:val="000000" w:themeColor="text1"/>
+          <w:sz w:val="20"/>
+          <w:szCs w:val="20"/>
+        </w:rPr>
+        <w:t>VENDEDOR</w:t>
+      </w:r>
+      <w:r>
+        <w:rPr>
+          <w:rFonts w:asciiTheme="minorHAnsi" w:eastAsiaTheme="minorHAnsi" w:hAnsiTheme="minorHAnsi" w:cstheme="minorHAnsi"/>
+          <w:color w:val="000000" w:themeColor="text1"/>
+          <w:sz w:val="20"/>
+          <w:szCs w:val="20"/>
+        </w:rPr>
+        <w:t xml:space="preserve"> multas e débitos existente</w:t>
+      </w:r>
+      <w:r>
+        <w:rPr>
+          <w:rFonts w:asciiTheme="minorHAnsi" w:eastAsiaTheme="minorHAnsi" w:hAnsiTheme="minorHAnsi" w:cstheme="minorHAnsi"/>
           <w:color w:val="000000" w:themeColor="text1"/>
           <w:sz w:val="20"/>
           <w:szCs w:val="24"/>
         </w:rPr>
-        <w:t xml:space="preserve">É também responsabilidade do </w:t>
-      </w:r>
-      <w:r>
-        <w:rPr>
-          <w:rFonts w:ascii="Arial" w:hAnsi="Arial" w:eastAsia="Arial" w:cs="Arial"/>
-          <w:b/>
-          <w:color w:val="000000" w:themeColor="text1"/>
-          <w:sz w:val="20"/>
-          <w:szCs w:val="24"/>
-        </w:rPr>
-        <w:t>VENDEDOR</w:t>
-      </w:r>
-      <w:r>
-        <w:rPr>
-          <w:rFonts w:ascii="Arial" w:hAnsi="Arial" w:eastAsia="Arial" w:cs="Arial"/>
-          <w:color w:val="000000" w:themeColor="text1"/>
-          <w:sz w:val="20"/>
-          <w:szCs w:val="24"/>
-        </w:rPr>
-        <w:t xml:space="preserve"> multas e débitos existente</w:t>
-      </w:r>
-      <w:r>
-        <w:rPr>
-          <w:rFonts w:ascii="Arial" w:hAnsi="Arial" w:eastAsia="Arial" w:cs="Arial"/>
-          <w:color w:val="000000" w:themeColor="text1"/>
-          <w:sz w:val="20"/>
-          <w:szCs w:val="24"/>
-        </w:rPr>
         <w:t>s</w:t>
       </w:r>
       <w:r>
         <w:rPr>
-          <w:rFonts w:ascii="Arial" w:hAnsi="Arial" w:eastAsia="Arial" w:cs="Arial"/>
-          <w:color w:val="000000" w:themeColor="text1"/>
-          <w:sz w:val="20"/>
-          <w:szCs w:val="24"/>
+          <w:rFonts w:asciiTheme="minorHAnsi" w:eastAsiaTheme="minorHAnsi" w:hAnsiTheme="minorHAnsi" w:cstheme="minorHAnsi"/>
+          <w:color w:val="000000" w:themeColor="text1"/>
+          <w:sz w:val="20"/>
+          <w:szCs w:val="20"/>
         </w:rPr>
         <w:t xml:space="preserve"> até a presente data, salvo aquelas acordadas entre as partes.</w:t>
       </w:r>
@@ -841,7 +841,7 @@
       </w:pPr>
       <w:r>
         <w:rPr>
-          <w:rFonts w:ascii="Arial" w:hAnsi="Arial" w:eastAsia="Arial" w:cs="Arial"/>
+          <w:rFonts w:asciiTheme="minorHAnsi" w:eastAsiaTheme="minorHAnsi" w:hAnsiTheme="minorHAnsi" w:cstheme="minorHAnsi"/>
           <w:sz w:val="4"/>
         </w:rPr>
       </w:r>
@@ -859,7 +859,7 @@
       </w:pPr>
       <w:r>
         <w:rPr>
-          <w:rFonts w:ascii="Arial" w:hAnsi="Arial" w:eastAsia="Arial" w:cs="Arial"/>
+          <w:rFonts w:asciiTheme="minorHAnsi" w:eastAsiaTheme="minorHAnsi" w:hAnsiTheme="minorHAnsi" w:cstheme="minorHAnsi"/>
           <w:sz w:val="4"/>
         </w:rPr>
       </w:r>
@@ -877,7 +877,7 @@
       </w:pPr>
       <w:r>
         <w:rPr>
-          <w:rFonts w:ascii="Arial" w:hAnsi="Arial" w:eastAsia="Arial" w:cs="Arial"/>
+          <w:rFonts w:asciiTheme="minorHAnsi" w:eastAsiaTheme="minorHAnsi" w:hAnsiTheme="minorHAnsi" w:cstheme="minorHAnsi"/>
           <w:sz w:val="4"/>
         </w:rPr>
       </w:r>
@@ -895,7 +895,7 @@
       </w:pPr>
       <w:r>
         <w:rPr>
-          <w:rFonts w:ascii="Arial" w:hAnsi="Arial" w:eastAsia="Arial" w:cs="Arial"/>
+          <w:rFonts w:asciiTheme="minorHAnsi" w:eastAsiaTheme="minorHAnsi" w:hAnsiTheme="minorHAnsi" w:cstheme="minorHAnsi"/>
           <w:sz w:val="4"/>
         </w:rPr>
       </w:r>
@@ -913,7 +913,7 @@
       </w:pPr>
       <w:r>
         <w:rPr>
-          <w:rFonts w:ascii="Arial" w:hAnsi="Arial" w:eastAsia="Arial" w:cs="Arial"/>
+          <w:rFonts w:asciiTheme="minorHAnsi" w:eastAsiaTheme="minorHAnsi" w:hAnsiTheme="minorHAnsi" w:cstheme="minorHAnsi"/>
           <w:sz w:val="4"/>
         </w:rPr>
       </w:r>
@@ -935,7 +935,7 @@
       <w:proofErr w:type="spellEnd"/>
       <w:r>
         <w:rPr>
-          <w:rFonts w:ascii="Arial" w:hAnsi="Arial" w:eastAsia="Arial" w:cs="Arial"/>
+          <w:rFonts w:asciiTheme="minorHAnsi" w:eastAsiaTheme="minorHAnsi" w:hAnsiTheme="minorHAnsi" w:cstheme="minorHAnsi"/>
           <w:b w:val="0"/>
           <w:sz w:val="20"/>
         </w:rPr>
@@ -943,7 +943,7 @@
       </w:r>
       <w:r>
         <w:rPr>
-          <w:rFonts w:ascii="Arial" w:hAnsi="Arial" w:eastAsia="Arial" w:cs="Arial"/>
+          <w:rFonts w:asciiTheme="minorHAnsi" w:eastAsiaTheme="minorHAnsi" w:hAnsiTheme="minorHAnsi" w:cstheme="minorHAnsi"/>
           <w:b/>
           <w:sz w:val="20"/>
         </w:rPr>
@@ -951,7 +951,7 @@
       </w:r>
       <w:r>
         <w:rPr>
-          <w:rFonts w:ascii="Arial" w:hAnsi="Arial" w:eastAsia="Arial" w:cs="Arial"/>
+          <w:rFonts w:asciiTheme="minorHAnsi" w:eastAsiaTheme="minorHAnsi" w:hAnsiTheme="minorHAnsi" w:cstheme="minorHAnsi"/>
           <w:b w:val="0"/>
           <w:sz w:val="20"/>
         </w:rPr>
@@ -959,7 +959,7 @@
       </w:r>
       <w:r>
         <w:rPr>
-          <w:rFonts w:ascii="Arial" w:hAnsi="Arial" w:eastAsia="Arial" w:cs="Arial"/>
+          <w:rFonts w:asciiTheme="minorHAnsi" w:eastAsiaTheme="minorHAnsi" w:hAnsiTheme="minorHAnsi" w:cstheme="minorHAnsi"/>
           <w:b/>
           <w:sz w:val="20"/>
         </w:rPr>
@@ -967,7 +967,7 @@
       </w:r>
       <w:r>
         <w:rPr>
-          <w:rFonts w:ascii="Arial" w:hAnsi="Arial" w:eastAsia="Arial" w:cs="Arial"/>
+          <w:rFonts w:asciiTheme="minorHAnsi" w:eastAsiaTheme="minorHAnsi" w:hAnsiTheme="minorHAnsi" w:cstheme="minorHAnsi"/>
           <w:b w:val="0"/>
           <w:sz w:val="20"/>
         </w:rPr>
@@ -985,11 +985,27 @@
       </w:pPr>
       <w:r>
         <w:rPr>
-          <w:rFonts w:ascii="Arial" w:hAnsi="Arial" w:eastAsia="Arial" w:cs="Arial"/>
+          <w:rFonts w:asciiTheme="minorHAnsi" w:eastAsiaTheme="minorHAnsi" w:hAnsiTheme="minorHAnsi" w:cstheme="minorHAnsi"/>
           <w:color w:val="000000"/>
+          <w:sz w:val="20"/>
+        </w:rPr>
+        <w:t xml:space="preserve"> </w:t>
+      </w:r>
+    </w:p>
+    <w:p>
+      <w:pPr>
+        <w:widowControl w:val="0"/>
+        <w:spacing w:after="0" w:line="40" w:lineRule="exact" w:before="0"/>
+        <w:jc w:val="both"/>
+        <w:rPr>
+          <w:color w:val="000000"/>
+        </w:rPr>
+      </w:pPr>
+      <w:r>
+        <w:rPr>
+          <w:rFonts w:asciiTheme="minorHAnsi" w:eastAsiaTheme="minorHAnsi" w:hAnsiTheme="minorHAnsi" w:cstheme="minorHAnsi"/>
           <w:sz w:val="4"/>
         </w:rPr>
-        <w:t xml:space="preserve"> </w:t>
       </w:r>
     </w:p>
     <w:p>
@@ -1003,7 +1019,7 @@
       </w:pPr>
       <w:r>
         <w:rPr>
-          <w:rFonts w:ascii="Arial" w:hAnsi="Arial" w:eastAsia="Arial" w:cs="Arial"/>
+          <w:rFonts w:asciiTheme="minorHAnsi" w:eastAsiaTheme="minorHAnsi" w:hAnsiTheme="minorHAnsi" w:cstheme="minorHAnsi"/>
           <w:sz w:val="4"/>
         </w:rPr>
       </w:r>
@@ -1019,7 +1035,7 @@
       </w:pPr>
       <w:r>
         <w:rPr>
-          <w:rFonts w:ascii="Arial" w:hAnsi="Arial" w:eastAsia="Arial" w:cs="Arial"/>
+          <w:rFonts w:asciiTheme="minorHAnsi" w:eastAsiaTheme="minorHAnsi" w:hAnsiTheme="minorHAnsi" w:cstheme="minorHAnsi"/>
           <w:sz w:val="4"/>
         </w:rPr>
       </w:r>
@@ -1035,7 +1051,7 @@
       </w:pPr>
       <w:r>
         <w:rPr>
-          <w:rFonts w:ascii="Arial" w:hAnsi="Arial" w:eastAsia="Arial" w:cs="Arial"/>
+          <w:rFonts w:asciiTheme="minorHAnsi" w:eastAsiaTheme="minorHAnsi" w:hAnsiTheme="minorHAnsi" w:cstheme="minorHAnsi"/>
           <w:sz w:val="4"/>
         </w:rPr>
       </w:r>
@@ -1051,34 +1067,18 @@
       </w:pPr>
       <w:r>
         <w:rPr>
-          <w:rFonts w:ascii="Arial" w:hAnsi="Arial" w:eastAsia="Arial" w:cs="Arial"/>
+          <w:rFonts w:asciiTheme="minorHAnsi" w:eastAsiaTheme="minorHAnsi" w:hAnsiTheme="minorHAnsi" w:cstheme="minorHAnsi"/>
           <w:sz w:val="4"/>
         </w:rPr>
       </w:r>
     </w:p>
     <w:p>
       <w:pPr>
-        <w:widowControl w:val="0"/>
-        <w:spacing w:after="0" w:line="40" w:lineRule="exact" w:before="0"/>
-        <w:jc w:val="both"/>
-        <w:rPr>
-          <w:color w:val="000000"/>
-        </w:rPr>
-      </w:pPr>
-      <w:r>
-        <w:rPr>
-          <w:rFonts w:ascii="Arial" w:hAnsi="Arial" w:eastAsia="Arial" w:cs="Arial"/>
-          <w:sz w:val="4"/>
-        </w:rPr>
-      </w:r>
-    </w:p>
-    <w:p>
-      <w:pPr>
         <w:spacing w:before="120" w:after="0" w:line="240" w:lineRule="auto"/>
       </w:pPr>
       <w:r>
         <w:rPr>
-          <w:rFonts w:ascii="Arial" w:hAnsi="Arial" w:eastAsia="Arial"/>
+          <w:rFonts w:asciiTheme="minorHAnsi" w:eastAsiaTheme="minorHAnsi" w:hAnsiTheme="minorHAnsi" w:cstheme="minorHAnsi"/>
           <w:sz w:val="8"/>
         </w:rPr>
       </w:r>
@@ -1122,7 +1122,7 @@
             </w:pPr>
             <w:r>
               <w:rPr>
-                <w:rFonts w:ascii="Arial" w:hAnsi="Arial" w:eastAsia="Arial"/>
+                <w:rFonts w:asciiTheme="minorHAnsi" w:eastAsiaTheme="minorHAnsi" w:hAnsiTheme="minorHAnsi" w:cstheme="minorHAnsi"/>
                 <w:b w:val="0"/>
                 <w:sz w:val="20"/>
               </w:rPr>
@@ -1167,7 +1167,7 @@
             </w:pPr>
             <w:r>
               <w:rPr>
-                <w:rFonts w:ascii="Arial" w:hAnsi="Arial" w:eastAsia="Arial"/>
+                <w:rFonts w:asciiTheme="minorHAnsi" w:eastAsiaTheme="minorHAnsi" w:hAnsiTheme="minorHAnsi" w:cstheme="minorHAnsi"/>
                 <w:b w:val="0"/>
                 <w:sz w:val="20"/>
               </w:rPr>
@@ -1195,7 +1195,7 @@
             </w:pPr>
             <w:r>
               <w:rPr>
-                <w:rFonts w:ascii="Arial" w:hAnsi="Arial" w:eastAsia="Arial"/>
+                <w:rFonts w:asciiTheme="minorHAnsi" w:eastAsiaTheme="minorHAnsi" w:hAnsiTheme="minorHAnsi" w:cstheme="minorHAnsi"/>
                 <w:b/>
                 <w:sz w:val="20"/>
               </w:rPr>
@@ -1240,7 +1240,7 @@
             </w:pPr>
             <w:r>
               <w:rPr>
-                <w:rFonts w:ascii="Arial" w:hAnsi="Arial" w:eastAsia="Arial"/>
+                <w:rFonts w:asciiTheme="minorHAnsi" w:eastAsiaTheme="minorHAnsi" w:hAnsiTheme="minorHAnsi" w:cstheme="minorHAnsi"/>
                 <w:b/>
                 <w:sz w:val="20"/>
               </w:rPr>
@@ -1474,7 +1474,7 @@
   <w:docDefaults>
     <w:rPrDefault>
       <w:rPr>
-        <w:rFonts w:asciiTheme="minorHAnsi" w:eastAsiaTheme="minorHAnsi" w:hAnsiTheme="minorHAnsi" w:cstheme="minorBidi"/>
+        <w:rFonts w:asciiTheme="minorHAnsi" w:eastAsiaTheme="minorHAnsi" w:hAnsiTheme="minorHAnsi" w:cstheme="minorHAnsi"/>
         <w:lang w:val="pt-BR" w:eastAsia="pt-BR" w:bidi="ar-SA"/>
       </w:rPr>
     </w:rPrDefault>
@@ -1857,9 +1857,9 @@
       <w:spacing w:after="200" w:line="276" w:lineRule="auto"/>
     </w:pPr>
     <w:rPr>
-      <w:rFonts w:ascii="Arial" w:eastAsia="Arial" w:hAnsi="Arial" w:cs="Calibri"/>
+      <w:rFonts w:asciiTheme="minorHAnsi" w:eastAsiaTheme="minorHAnsi" w:hAnsiTheme="minorHAnsi" w:cstheme="minorHAnsi"/>
       <w:sz w:val="20"/>
-      <w:szCs w:val="22"/>
+      <w:szCs w:val="20"/>
       <w:lang w:eastAsia="zh-CN"/>
     </w:rPr>
   </w:style>
@@ -1901,9 +1901,9 @@
       <w:spacing w:after="0" w:line="240" w:lineRule="auto"/>
     </w:pPr>
     <w:rPr>
-      <w:rFonts w:ascii="Segoe UI" w:hAnsi="Segoe UI" w:cs="Segoe UI"/>
-      <w:sz w:val="18"/>
-      <w:szCs w:val="18"/>
+      <w:rFonts w:asciiTheme="minorHAnsi" w:eastAsiaTheme="minorHAnsi" w:hAnsiTheme="minorHAnsi" w:cstheme="minorHAnsi"/>
+      <w:sz w:val="20"/>
+      <w:szCs w:val="20"/>
     </w:rPr>
   </w:style>
   <w:style w:type="character" w:customStyle="1" w:styleId="TextodebaloChar">
@@ -1913,9 +1913,9 @@
     <w:uiPriority w:val="99"/>
     <w:semiHidden/>
     <w:rPr>
-      <w:rFonts w:ascii="Segoe UI" w:eastAsia="SimSun" w:hAnsi="Segoe UI" w:cs="Segoe UI"/>
-      <w:sz w:val="18"/>
-      <w:szCs w:val="18"/>
+      <w:rFonts w:asciiTheme="minorHAnsi" w:eastAsiaTheme="minorHAnsi" w:hAnsiTheme="minorHAnsi" w:cstheme="minorHAnsi"/>
+      <w:sz w:val="20"/>
+      <w:szCs w:val="20"/>
       <w:lang w:eastAsia="zh-CN"/>
     </w:rPr>
   </w:style>
@@ -1941,9 +1941,9 @@
     <w:uiPriority w:val="99"/>
     <w:rsid w:val="00A364FC"/>
     <w:rPr>
-      <w:rFonts w:ascii="Calibri" w:eastAsia="SimSun" w:hAnsi="Calibri" w:cs="Calibri"/>
-      <w:sz w:val="22"/>
-      <w:szCs w:val="22"/>
+      <w:rFonts w:asciiTheme="minorHAnsi" w:eastAsiaTheme="minorHAnsi" w:hAnsiTheme="minorHAnsi" w:cstheme="minorHAnsi"/>
+      <w:sz w:val="20"/>
+      <w:szCs w:val="20"/>
       <w:lang w:eastAsia="zh-CN"/>
     </w:rPr>
   </w:style>
@@ -1969,9 +1969,9 @@
     <w:uiPriority w:val="99"/>
     <w:rsid w:val="00A364FC"/>
     <w:rPr>
-      <w:rFonts w:ascii="Calibri" w:eastAsia="SimSun" w:hAnsi="Calibri" w:cs="Calibri"/>
-      <w:sz w:val="22"/>
-      <w:szCs w:val="22"/>
+      <w:rFonts w:asciiTheme="minorHAnsi" w:eastAsiaTheme="minorHAnsi" w:hAnsiTheme="minorHAnsi" w:cstheme="minorHAnsi"/>
+      <w:sz w:val="20"/>
+      <w:szCs w:val="20"/>
       <w:lang w:eastAsia="zh-CN"/>
     </w:rPr>
   </w:style>

</xml_diff>

<commit_message>
Deixa o arquivo baixado igual ao que a previa mostra
Fonte e tamanho ja batiam, mas o arquivo do Word ainda saia
com a logo em 5,00 x 1,86 cm e entrelinha simples, enquanto a
previa mostrava 9,21 x 3 cm e entrelinha 1,5. Quem conferia na
tela e imprimia pelo Word via dois documentos diferentes.

Os espacamentos marcados como exatos ficaram como estavam: sao
as faixas finas que separam os blocos do cabecalho, e estica-
las bagunca o desenho da folha. A marca d'agua tambem nao foi
tocada - ela vive no cabecalho do Word.

Co-Authored-By: Claude Opus 5 <noreply@anthropic.com>
Claude-Session: https://claude.ai/code/session_012MYCC1xTUZEDcE2GxQr3mc
</commit_message>
<xml_diff>
--- a/public/templates/contrato-compra.docx
+++ b/public/templates/contrato-compra.docx
@@ -5,7 +5,7 @@
     <w:p>
       <w:pPr>
         <w:widowControl w:val="0"/>
-        <w:spacing w:after="20" w:line="240" w:lineRule="auto" w:before="0"/>
+        <w:spacing w:after="20" w:line="360" w:lineRule="auto" w:before="0"/>
         <w:jc w:val="center"/>
         <w:rPr>
           <w:rFonts w:asciiTheme="minorHAnsi" w:eastAsiaTheme="minorHAnsi" w:hAnsiTheme="minorHAnsi" w:cstheme="minorHAnsi"/>
@@ -24,7 +24,7 @@
       <w:r>
         <w:drawing>
           <wp:inline xmlns:a="http://schemas.openxmlformats.org/drawingml/2006/main" xmlns:pic="http://schemas.openxmlformats.org/drawingml/2006/picture">
-            <wp:extent cx="1800000" cy="669014"/>
+            <wp:extent cx="3315600" cy="1080000"/>
             <wp:docPr id="1" name="Picture 1"/>
             <wp:cNvGraphicFramePr>
               <a:graphicFrameLocks noChangeAspect="1"/>
@@ -45,7 +45,7 @@
                   <pic:spPr>
                     <a:xfrm>
                       <a:off x="0" y="0"/>
-                      <a:ext cx="1800000" cy="669014"/>
+                      <a:ext cx="3315600" cy="1080000"/>
                     </a:xfrm>
                     <a:prstGeom prst="rect"/>
                   </pic:spPr>
@@ -59,7 +59,7 @@
     <w:p>
       <w:pPr>
         <w:widowControl w:val="0"/>
-        <w:spacing w:after="0" w:line="240" w:lineRule="auto" w:before="0"/>
+        <w:spacing w:after="0" w:line="360" w:lineRule="auto" w:before="0"/>
         <w:jc w:val="center"/>
         <w:rPr>
           <w:rFonts w:asciiTheme="minorHAnsi" w:eastAsiaTheme="minorHAnsi" w:hAnsiTheme="minorHAnsi" w:cstheme="minorHAnsi"/>
@@ -87,7 +87,7 @@
     <w:p>
       <w:pPr>
         <w:widowControl w:val="0"/>
-        <w:spacing w:after="0" w:line="240" w:lineRule="auto" w:before="0"/>
+        <w:spacing w:after="0" w:line="360" w:lineRule="auto" w:before="0"/>
         <w:jc w:val="center"/>
         <w:rPr>
           <w:rFonts w:asciiTheme="minorHAnsi" w:eastAsiaTheme="minorHAnsi" w:hAnsiTheme="minorHAnsi" w:cstheme="minorHAnsi"/>
@@ -115,7 +115,7 @@
     <w:p>
       <w:pPr>
         <w:widowControl w:val="0"/>
-        <w:spacing w:after="0" w:line="240" w:lineRule="auto" w:before="0"/>
+        <w:spacing w:after="0" w:line="360" w:lineRule="auto" w:before="0"/>
         <w:jc w:val="center"/>
         <w:rPr>
           <w:rFonts w:asciiTheme="minorHAnsi" w:eastAsiaTheme="minorHAnsi" w:hAnsiTheme="minorHAnsi" w:cstheme="minorHAnsi"/>
@@ -201,7 +201,7 @@
     <w:p>
       <w:pPr>
         <w:widowControl w:val="0"/>
-        <w:spacing w:after="40" w:line="259" w:lineRule="auto" w:before="0"/>
+        <w:spacing w:after="40" w:line="360" w:lineRule="auto" w:before="0"/>
         <w:jc w:val="both"/>
         <w:rPr>
           <w:rFonts w:asciiTheme="minorHAnsi" w:eastAsiaTheme="minorHAnsi" w:hAnsiTheme="minorHAnsi" w:cstheme="minorHAnsi"/>
@@ -502,7 +502,7 @@
     <w:p>
       <w:pPr>
         <w:widowControl w:val="0"/>
-        <w:spacing w:after="40" w:line="259" w:lineRule="auto" w:before="0"/>
+        <w:spacing w:after="40" w:line="360" w:lineRule="auto" w:before="0"/>
         <w:jc w:val="both"/>
         <w:rPr>
           <w:rFonts w:asciiTheme="minorHAnsi" w:eastAsiaTheme="minorHAnsi" w:hAnsiTheme="minorHAnsi" w:cstheme="minorHAnsi"/>
@@ -579,7 +579,7 @@
     <w:p>
       <w:pPr>
         <w:widowControl w:val="0"/>
-        <w:spacing w:after="40" w:line="259" w:lineRule="auto" w:before="0"/>
+        <w:spacing w:after="40" w:line="360" w:lineRule="auto" w:before="0"/>
         <w:jc w:val="both"/>
         <w:rPr>
           <w:color w:val="000000" w:themeColor="text1"/>
@@ -715,7 +715,7 @@
     <w:p>
       <w:pPr>
         <w:widowControl w:val="0"/>
-        <w:spacing w:after="40" w:line="259" w:lineRule="auto" w:before="0"/>
+        <w:spacing w:after="40" w:line="360" w:lineRule="auto" w:before="0"/>
         <w:jc w:val="both"/>
         <w:rPr>
           <w:color w:val="000000" w:themeColor="text1"/>
@@ -773,7 +773,7 @@
     <w:p>
       <w:pPr>
         <w:widowControl w:val="0"/>
-        <w:spacing w:after="40" w:line="259" w:lineRule="auto" w:before="0"/>
+        <w:spacing w:after="40" w:line="360" w:lineRule="auto" w:before="0"/>
         <w:jc w:val="both"/>
         <w:rPr>
           <w:color w:val="000000" w:themeColor="text1"/>
@@ -921,7 +921,7 @@
     <w:p>
       <w:pPr>
         <w:widowControl w:val="0"/>
-        <w:spacing w:after="840" w:line="259" w:lineRule="auto" w:before="0"/>
+        <w:spacing w:after="840" w:line="360" w:lineRule="auto" w:before="0"/>
         <w:jc w:val="both"/>
         <w:rPr>
           <w:color w:val="000000"/>
@@ -1074,7 +1074,7 @@
     </w:p>
     <w:p>
       <w:pPr>
-        <w:spacing w:before="120" w:after="0" w:line="240" w:lineRule="auto"/>
+        <w:spacing w:before="120" w:after="0" w:line="360" w:lineRule="auto"/>
       </w:pPr>
       <w:r>
         <w:rPr>
@@ -1117,7 +1117,7 @@
           </w:tcPr>
           <w:p>
             <w:pPr>
-              <w:spacing w:before="0" w:after="100" w:line="240" w:lineRule="auto"/>
+              <w:spacing w:before="0" w:after="100" w:line="360" w:lineRule="auto"/>
               <w:jc w:val="center"/>
             </w:pPr>
             <w:r>
@@ -1162,7 +1162,7 @@
           </w:tcPr>
           <w:p>
             <w:pPr>
-              <w:spacing w:before="0" w:after="100" w:line="240" w:lineRule="auto"/>
+              <w:spacing w:before="0" w:after="100" w:line="360" w:lineRule="auto"/>
               <w:jc w:val="center"/>
             </w:pPr>
             <w:r>
@@ -1190,7 +1190,7 @@
           </w:tcPr>
           <w:p>
             <w:pPr>
-              <w:spacing w:before="0" w:after="0" w:line="240" w:lineRule="auto"/>
+              <w:spacing w:before="0" w:after="0" w:line="360" w:lineRule="auto"/>
               <w:jc w:val="center"/>
             </w:pPr>
             <w:r>
@@ -1235,7 +1235,7 @@
           </w:tcPr>
           <w:p>
             <w:pPr>
-              <w:spacing w:before="0" w:after="0" w:line="240" w:lineRule="auto"/>
+              <w:spacing w:before="0" w:after="0" w:line="360" w:lineRule="auto"/>
               <w:jc w:val="center"/>
             </w:pPr>
             <w:r>
@@ -1854,7 +1854,7 @@
     <w:name w:val="Normal"/>
     <w:qFormat/>
     <w:pPr>
-      <w:spacing w:after="200" w:line="276" w:lineRule="auto"/>
+      <w:spacing w:after="200" w:line="360" w:lineRule="auto"/>
     </w:pPr>
     <w:rPr>
       <w:rFonts w:asciiTheme="minorHAnsi" w:eastAsiaTheme="minorHAnsi" w:hAnsiTheme="minorHAnsi" w:cstheme="minorHAnsi"/>
@@ -1898,7 +1898,7 @@
     <w:semiHidden/>
     <w:unhideWhenUsed/>
     <w:pPr>
-      <w:spacing w:after="0" w:line="240" w:lineRule="auto"/>
+      <w:spacing w:after="0" w:line="360" w:lineRule="auto"/>
     </w:pPr>
     <w:rPr>
       <w:rFonts w:asciiTheme="minorHAnsi" w:eastAsiaTheme="minorHAnsi" w:hAnsiTheme="minorHAnsi" w:cstheme="minorHAnsi"/>
@@ -1931,7 +1931,7 @@
         <w:tab w:val="center" w:pos="4252"/>
         <w:tab w:val="right" w:pos="8504"/>
       </w:tabs>
-      <w:spacing w:after="0" w:line="240" w:lineRule="auto"/>
+      <w:spacing w:after="0" w:line="360" w:lineRule="auto"/>
     </w:pPr>
   </w:style>
   <w:style w:type="character" w:customStyle="1" w:styleId="CabealhoChar">
@@ -1959,7 +1959,7 @@
         <w:tab w:val="center" w:pos="4252"/>
         <w:tab w:val="right" w:pos="8504"/>
       </w:tabs>
-      <w:spacing w:after="0" w:line="240" w:lineRule="auto"/>
+      <w:spacing w:after="0" w:line="360" w:lineRule="auto"/>
     </w:pPr>
   </w:style>
   <w:style w:type="character" w:customStyle="1" w:styleId="RodapChar">

</xml_diff>